<commit_message>
docs: Atualização na documentação destacando a automatização na criação e configuração do database
</commit_message>
<xml_diff>
--- a/docs/Manual Tecnico.docx
+++ b/docs/Manual Tecnico.docx
@@ -422,7 +422,21 @@
         <w:rPr>
           <w:rtl w:val="0"/>
         </w:rPr>
-        <w:t xml:space="preserve">É necessário executar os scripts SQL fornecidos no diretório de configuração do banco de dados, responsáveis por:</w:t>
+        <w:t xml:space="preserve">Durante a inicialização da aplicação, o sistema verifica a existência do banco de dados e de seus objetos, realizando automaticamente a criação da estrutura necessária, a inserção dos dados iniciais e a criação das </w:t>
+      </w:r>
+      <w:r>
+        <w:rPr>
+          <w:i w:val="1"/>
+          <w:iCs w:val="1"/>
+          <w:rtl w:val="0"/>
+        </w:rPr>
+        <w:t xml:space="preserve">views</w:t>
+      </w:r>
+      <w:r>
+        <w:rPr>
+          <w:rtl w:val="0"/>
+        </w:rPr>
+        <w:t xml:space="preserve">, quando aplicável. </w:t>
       </w:r>
     </w:p>
     <w:p>
@@ -485,7 +499,7 @@
         <w:rPr>
           <w:rtl w:val="0"/>
         </w:rPr>
-        <w:t xml:space="preserve">Esses scripts garantem que a estrutura do banco esteja alinhada com as necessidades da API e com o controle de escopo implementado.</w:t>
+        <w:t xml:space="preserve">Essa abordagem simplifica a implantação do sistema, reduz a necessidade de configurações manuais e garante que a estrutura do banco de dados permaneça consistente com os requisitos da aplicação e com o controle de escopo implementado. </w:t>
       </w:r>
     </w:p>
     <w:p>

</xml_diff>

<commit_message>
docs: Modificação no manual técnico da API
</commit_message>
<xml_diff>
--- a/docs/Manual Tecnico.docx
+++ b/docs/Manual Tecnico.docx
@@ -2664,6 +2664,22 @@
           <w:color w:val="188038"/>
           <w:rtl w:val="0"/>
         </w:rPr>
+        <w:t xml:space="preserve">  "ID_ASSOCIACAO": "1",</w:t>
+      </w:r>
+    </w:p>
+    <w:p>
+      <w:pPr>
+        <w:rPr>
+          <w:rFonts w:ascii="Roboto Mono" w:cs="Roboto Mono" w:eastAsia="Roboto Mono" w:hAnsi="Roboto Mono"/>
+          <w:color w:val="188038"/>
+        </w:rPr>
+      </w:pPr>
+      <w:r>
+        <w:rPr>
+          <w:rFonts w:ascii="Roboto Mono" w:cs="Roboto Mono" w:eastAsia="Roboto Mono" w:hAnsi="Roboto Mono"/>
+          <w:color w:val="188038"/>
+          <w:rtl w:val="0"/>
+        </w:rPr>
         <w:t xml:space="preserve">  "NIVEL": 1,</w:t>
       </w:r>
     </w:p>
@@ -2792,7 +2808,7 @@
           <w:bCs w:val="1"/>
           <w:rtl w:val="0"/>
         </w:rPr>
-        <w:t xml:space="preserve">Atualizar usuário</w:t>
+        <w:t xml:space="preserve">Atualizar dados do usuário</w:t>
       </w:r>
     </w:p>
     <w:p>
@@ -2905,39 +2921,23 @@
           <w:color w:val="188038"/>
           <w:rtl w:val="0"/>
         </w:rPr>
-        <w:t xml:space="preserve">  "NIVEL": 2,</w:t>
-      </w:r>
-    </w:p>
-    <w:p>
-      <w:pPr>
-        <w:rPr>
-          <w:rFonts w:ascii="Roboto Mono" w:cs="Roboto Mono" w:eastAsia="Roboto Mono" w:hAnsi="Roboto Mono"/>
-          <w:color w:val="188038"/>
-        </w:rPr>
-      </w:pPr>
-      <w:r>
-        <w:rPr>
-          <w:rFonts w:ascii="Roboto Mono" w:cs="Roboto Mono" w:eastAsia="Roboto Mono" w:hAnsi="Roboto Mono"/>
-          <w:color w:val="188038"/>
-          <w:rtl w:val="0"/>
-        </w:rPr>
-        <w:t xml:space="preserve">  "LOGIN": "novo_login",</w:t>
-      </w:r>
-    </w:p>
-    <w:p>
-      <w:pPr>
-        <w:rPr>
-          <w:rFonts w:ascii="Roboto Mono" w:cs="Roboto Mono" w:eastAsia="Roboto Mono" w:hAnsi="Roboto Mono"/>
-          <w:color w:val="188038"/>
-        </w:rPr>
-      </w:pPr>
-      <w:r>
-        <w:rPr>
-          <w:rFonts w:ascii="Roboto Mono" w:cs="Roboto Mono" w:eastAsia="Roboto Mono" w:hAnsi="Roboto Mono"/>
-          <w:color w:val="188038"/>
-          <w:rtl w:val="0"/>
-        </w:rPr>
-        <w:t xml:space="preserve">  "SENHA": "nova_senha"</w:t>
+        <w:t xml:space="preserve">  "ID_ASSOCIACAO": "",</w:t>
+      </w:r>
+    </w:p>
+    <w:p>
+      <w:pPr>
+        <w:rPr>
+          <w:rFonts w:ascii="Roboto Mono" w:cs="Roboto Mono" w:eastAsia="Roboto Mono" w:hAnsi="Roboto Mono"/>
+          <w:color w:val="188038"/>
+        </w:rPr>
+      </w:pPr>
+      <w:r>
+        <w:rPr>
+          <w:rFonts w:ascii="Roboto Mono" w:cs="Roboto Mono" w:eastAsia="Roboto Mono" w:hAnsi="Roboto Mono"/>
+          <w:color w:val="188038"/>
+          <w:rtl w:val="0"/>
+        </w:rPr>
+        <w:t xml:space="preserve">  "NIVEL": 2</w:t>
       </w:r>
     </w:p>
     <w:p>
@@ -2954,6 +2954,151 @@
           <w:rtl w:val="0"/>
         </w:rPr>
         <w:t xml:space="preserve">}</w:t>
+      </w:r>
+    </w:p>
+    <w:p>
+      <w:pPr>
+        <w:rPr/>
+      </w:pPr>
+      <w:r>
+        <w:rPr>
+          <w:rtl w:val="0"/>
+        </w:rPr>
+      </w:r>
+    </w:p>
+    <w:p>
+      <w:pPr>
+        <w:spacing w:after="40" w:before="240" w:lineRule="auto"/>
+        <w:rPr>
+          <w:b w:val="1"/>
+          <w:bCs w:val="1"/>
+        </w:rPr>
+      </w:pPr>
+      <w:r>
+        <w:rPr>
+          <w:b w:val="1"/>
+          <w:bCs w:val="1"/>
+          <w:rtl w:val="0"/>
+        </w:rPr>
+        <w:t xml:space="preserve">Atualizar login do usuário</w:t>
+      </w:r>
+    </w:p>
+    <w:p>
+      <w:pPr>
+        <w:spacing w:after="240" w:before="240" w:lineRule="auto"/>
+        <w:rPr>
+          <w:rFonts w:ascii="Roboto Mono" w:cs="Roboto Mono" w:eastAsia="Roboto Mono" w:hAnsi="Roboto Mono"/>
+          <w:color w:val="188038"/>
+        </w:rPr>
+      </w:pPr>
+      <w:r>
+        <w:rPr>
+          <w:b w:val="1"/>
+          <w:bCs w:val="1"/>
+          <w:rtl w:val="0"/>
+        </w:rPr>
+        <w:t xml:space="preserve">Rota:</w:t>
+        <w:br w:type="textWrapping"/>
+      </w:r>
+      <w:r>
+        <w:rPr>
+          <w:rtl w:val="0"/>
+        </w:rPr>
+        <w:t xml:space="preserve"> PUT </w:t>
+      </w:r>
+      <w:r>
+        <w:rPr>
+          <w:rFonts w:ascii="Roboto Mono" w:cs="Roboto Mono" w:eastAsia="Roboto Mono" w:hAnsi="Roboto Mono"/>
+          <w:color w:val="188038"/>
+          <w:rtl w:val="0"/>
+        </w:rPr>
+        <w:t xml:space="preserve">/usuarios/update/login/{id}</w:t>
+      </w:r>
+    </w:p>
+    <w:p>
+      <w:pPr>
+        <w:spacing w:after="240" w:before="240" w:lineRule="auto"/>
+        <w:rPr>
+          <w:b w:val="1"/>
+          <w:bCs w:val="1"/>
+        </w:rPr>
+      </w:pPr>
+      <w:r>
+        <w:rPr>
+          <w:b w:val="1"/>
+          <w:bCs w:val="1"/>
+          <w:rtl w:val="0"/>
+        </w:rPr>
+        <w:t xml:space="preserve">Payload da Requisição:</w:t>
+      </w:r>
+    </w:p>
+    <w:p>
+      <w:pPr>
+        <w:rPr>
+          <w:rFonts w:ascii="Roboto Mono" w:cs="Roboto Mono" w:eastAsia="Roboto Mono" w:hAnsi="Roboto Mono"/>
+          <w:color w:val="188038"/>
+        </w:rPr>
+      </w:pPr>
+      <w:r>
+        <w:rPr>
+          <w:rFonts w:ascii="Roboto Mono" w:cs="Roboto Mono" w:eastAsia="Roboto Mono" w:hAnsi="Roboto Mono"/>
+          <w:color w:val="188038"/>
+          <w:rtl w:val="0"/>
+        </w:rPr>
+        <w:t xml:space="preserve">{</w:t>
+      </w:r>
+    </w:p>
+    <w:p>
+      <w:pPr>
+        <w:rPr>
+          <w:rFonts w:ascii="Roboto Mono" w:cs="Roboto Mono" w:eastAsia="Roboto Mono" w:hAnsi="Roboto Mono"/>
+          <w:color w:val="188038"/>
+        </w:rPr>
+      </w:pPr>
+      <w:r>
+        <w:rPr>
+          <w:rFonts w:ascii="Roboto Mono" w:cs="Roboto Mono" w:eastAsia="Roboto Mono" w:hAnsi="Roboto Mono"/>
+          <w:color w:val="188038"/>
+          <w:rtl w:val="0"/>
+        </w:rPr>
+        <w:t xml:space="preserve">  "LOGIN": "admin",</w:t>
+      </w:r>
+    </w:p>
+    <w:p>
+      <w:pPr>
+        <w:rPr>
+          <w:rFonts w:ascii="Roboto Mono" w:cs="Roboto Mono" w:eastAsia="Roboto Mono" w:hAnsi="Roboto Mono"/>
+          <w:color w:val="188038"/>
+        </w:rPr>
+      </w:pPr>
+      <w:r>
+        <w:rPr>
+          <w:rFonts w:ascii="Roboto Mono" w:cs="Roboto Mono" w:eastAsia="Roboto Mono" w:hAnsi="Roboto Mono"/>
+          <w:color w:val="188038"/>
+          <w:rtl w:val="0"/>
+        </w:rPr>
+        <w:t xml:space="preserve">  "SENHA": "admin"</w:t>
+      </w:r>
+    </w:p>
+    <w:p>
+      <w:pPr>
+        <w:rPr>
+          <w:rFonts w:ascii="Roboto Mono" w:cs="Roboto Mono" w:eastAsia="Roboto Mono" w:hAnsi="Roboto Mono"/>
+          <w:color w:val="188038"/>
+        </w:rPr>
+      </w:pPr>
+      <w:r>
+        <w:rPr>
+          <w:rFonts w:ascii="Roboto Mono" w:cs="Roboto Mono" w:eastAsia="Roboto Mono" w:hAnsi="Roboto Mono"/>
+          <w:color w:val="188038"/>
+          <w:rtl w:val="0"/>
+        </w:rPr>
+        <w:t xml:space="preserve">}</w:t>
+      </w:r>
+      <w:r>
+        <w:rPr>
+          <w:rtl w:val="0"/>
+        </w:rPr>
       </w:r>
     </w:p>
     <w:p>

</xml_diff>

<commit_message>
docs: Atualização do Manual Tecnico para a V0.7.0-alpha
</commit_message>
<xml_diff>
--- a/docs/Manual Tecnico.docx
+++ b/docs/Manual Tecnico.docx
@@ -151,6 +151,623 @@
           <w:rtl w:val="0"/>
         </w:rPr>
         <w:t xml:space="preserve">2.1 Requisitos de Software</w:t>
+      </w:r>
+    </w:p>
+    <w:p>
+      <w:pPr>
+        <w:numPr>
+          <w:ilvl w:val="0"/>
+          <w:numId w:val="7"/>
+        </w:numPr>
+        <w:spacing w:after="0" w:afterAutospacing="0" w:before="240" w:lineRule="auto"/>
+        <w:ind w:left="720" w:hanging="360"/>
+      </w:pPr>
+      <w:r>
+        <w:rPr>
+          <w:rtl w:val="0"/>
+        </w:rPr>
+        <w:t xml:space="preserve">Node.js versão 14 ou superior</w:t>
+        <w:br w:type="textWrapping"/>
+      </w:r>
+    </w:p>
+    <w:p>
+      <w:pPr>
+        <w:numPr>
+          <w:ilvl w:val="0"/>
+          <w:numId w:val="7"/>
+        </w:numPr>
+        <w:spacing w:after="0" w:afterAutospacing="0" w:before="0" w:beforeAutospacing="0" w:lineRule="auto"/>
+        <w:ind w:left="720" w:hanging="360"/>
+      </w:pPr>
+      <w:r>
+        <w:rPr>
+          <w:rtl w:val="0"/>
+        </w:rPr>
+        <w:t xml:space="preserve">MySQL (ou banco de dados relacional compatível)</w:t>
+        <w:br w:type="textWrapping"/>
+      </w:r>
+    </w:p>
+    <w:p>
+      <w:pPr>
+        <w:numPr>
+          <w:ilvl w:val="0"/>
+          <w:numId w:val="7"/>
+        </w:numPr>
+        <w:spacing w:after="0" w:afterAutospacing="0" w:before="0" w:beforeAutospacing="0" w:lineRule="auto"/>
+        <w:ind w:left="720" w:hanging="360"/>
+      </w:pPr>
+      <w:r>
+        <w:rPr>
+          <w:rtl w:val="0"/>
+        </w:rPr>
+        <w:t xml:space="preserve">Gerenciador de pacotes NPM ou Yarn</w:t>
+        <w:br w:type="textWrapping"/>
+      </w:r>
+    </w:p>
+    <w:p>
+      <w:pPr>
+        <w:numPr>
+          <w:ilvl w:val="0"/>
+          <w:numId w:val="7"/>
+        </w:numPr>
+        <w:spacing w:after="240" w:before="0" w:beforeAutospacing="0" w:lineRule="auto"/>
+        <w:ind w:left="720" w:hanging="360"/>
+      </w:pPr>
+      <w:r>
+        <w:rPr>
+          <w:rtl w:val="0"/>
+        </w:rPr>
+        <w:t xml:space="preserve">Ferramentas de teste de API, como Insomnia ou Postman</w:t>
+        <w:br w:type="textWrapping"/>
+      </w:r>
+    </w:p>
+    <w:p>
+      <w:pPr>
+        <w:pStyle w:val="Heading3"/>
+        <w:keepNext w:val="0"/>
+        <w:keepLines w:val="0"/>
+        <w:spacing w:before="280" w:lineRule="auto"/>
+        <w:rPr>
+          <w:b w:val="1"/>
+          <w:bCs w:val="1"/>
+          <w:color w:val="000000"/>
+          <w:sz w:val="26"/>
+          <w:szCs w:val="26"/>
+        </w:rPr>
+      </w:pPr>
+      <w:bookmarkStart w:colFirst="0" w:colLast="0" w:name="_8riwmobplt7a" w:id="5"/>
+      <w:bookmarkEnd w:id="5"/>
+      <w:r>
+        <w:rPr>
+          <w:b w:val="1"/>
+          <w:bCs w:val="1"/>
+          <w:color w:val="000000"/>
+          <w:sz w:val="26"/>
+          <w:szCs w:val="26"/>
+          <w:rtl w:val="0"/>
+        </w:rPr>
+        <w:t xml:space="preserve">2.2 Requisitos de Ambiente</w:t>
+      </w:r>
+    </w:p>
+    <w:p>
+      <w:pPr>
+        <w:numPr>
+          <w:ilvl w:val="0"/>
+          <w:numId w:val="12"/>
+        </w:numPr>
+        <w:spacing w:after="0" w:afterAutospacing="0" w:before="240" w:lineRule="auto"/>
+        <w:ind w:left="720" w:hanging="360"/>
+      </w:pPr>
+      <w:r>
+        <w:rPr>
+          <w:rtl w:val="0"/>
+        </w:rPr>
+        <w:t xml:space="preserve">Sistema operacional Windows, Linux ou macOS</w:t>
+        <w:br w:type="textWrapping"/>
+      </w:r>
+    </w:p>
+    <w:p>
+      <w:pPr>
+        <w:numPr>
+          <w:ilvl w:val="0"/>
+          <w:numId w:val="12"/>
+        </w:numPr>
+        <w:spacing w:after="0" w:afterAutospacing="0" w:before="0" w:beforeAutospacing="0" w:lineRule="auto"/>
+        <w:ind w:left="720" w:hanging="360"/>
+      </w:pPr>
+      <w:r>
+        <w:rPr>
+          <w:rtl w:val="0"/>
+        </w:rPr>
+        <w:t xml:space="preserve">Acesso a terminal ou prompt de comando</w:t>
+        <w:br w:type="textWrapping"/>
+      </w:r>
+    </w:p>
+    <w:p>
+      <w:pPr>
+        <w:numPr>
+          <w:ilvl w:val="0"/>
+          <w:numId w:val="12"/>
+        </w:numPr>
+        <w:spacing w:after="240" w:before="0" w:beforeAutospacing="0" w:lineRule="auto"/>
+        <w:ind w:left="720" w:hanging="360"/>
+      </w:pPr>
+      <w:r>
+        <w:rPr>
+          <w:rtl w:val="0"/>
+        </w:rPr>
+        <w:t xml:space="preserve">Permissões para criação e manipulação de banco de dados MySQL</w:t>
+        <w:br w:type="textWrapping"/>
+      </w:r>
+    </w:p>
+    <w:p>
+      <w:pPr>
+        <w:spacing w:after="240" w:before="240" w:lineRule="auto"/>
+        <w:rPr/>
+      </w:pPr>
+      <w:r>
+        <w:rPr>
+          <w:rtl w:val="0"/>
+        </w:rPr>
+      </w:r>
+    </w:p>
+    <w:p>
+      <w:pPr>
+        <w:pStyle w:val="Heading2"/>
+        <w:keepNext w:val="0"/>
+        <w:keepLines w:val="0"/>
+        <w:spacing w:after="80" w:lineRule="auto"/>
+        <w:rPr>
+          <w:b w:val="1"/>
+          <w:bCs w:val="1"/>
+          <w:sz w:val="34"/>
+          <w:szCs w:val="34"/>
+        </w:rPr>
+      </w:pPr>
+      <w:bookmarkStart w:colFirst="0" w:colLast="0" w:name="_b64vvry82e5t" w:id="6"/>
+      <w:bookmarkEnd w:id="6"/>
+      <w:r>
+        <w:rPr>
+          <w:b w:val="1"/>
+          <w:bCs w:val="1"/>
+          <w:sz w:val="34"/>
+          <w:szCs w:val="34"/>
+          <w:rtl w:val="0"/>
+        </w:rPr>
+        <w:t xml:space="preserve">3. Instalação do Sistema</w:t>
+      </w:r>
+    </w:p>
+    <w:p>
+      <w:pPr>
+        <w:spacing w:after="240" w:before="240" w:lineRule="auto"/>
+        <w:rPr/>
+      </w:pPr>
+      <w:r>
+        <w:rPr>
+          <w:rtl w:val="0"/>
+        </w:rPr>
+        <w:t xml:space="preserve">Inicialmente, deve-se clonar o repositório oficial do projeto e acessar a pasta da API principal. Em seguida, as dependências do projeto devem ser instaladas utilizando o gerenciador de pacotes escolhido.</w:t>
+      </w:r>
+    </w:p>
+    <w:p>
+      <w:pPr>
+        <w:spacing w:after="240" w:before="240" w:lineRule="auto"/>
+        <w:rPr/>
+      </w:pPr>
+      <w:r>
+        <w:rPr>
+          <w:rtl w:val="0"/>
+        </w:rPr>
+        <w:t xml:space="preserve">Após a instalação das dependências, o ambiente estará preparado para a configuração do banco de dados e execução da aplicação.</w:t>
+      </w:r>
+    </w:p>
+    <w:p>
+      <w:pPr>
+        <w:pStyle w:val="Heading2"/>
+        <w:keepNext w:val="0"/>
+        <w:keepLines w:val="0"/>
+        <w:spacing w:after="80" w:lineRule="auto"/>
+        <w:rPr>
+          <w:b w:val="1"/>
+          <w:bCs w:val="1"/>
+          <w:sz w:val="34"/>
+          <w:szCs w:val="34"/>
+        </w:rPr>
+      </w:pPr>
+      <w:bookmarkStart w:colFirst="0" w:colLast="0" w:name="_y0838svg03nn" w:id="7"/>
+      <w:bookmarkEnd w:id="7"/>
+      <w:r>
+        <w:rPr>
+          <w:b w:val="1"/>
+          <w:bCs w:val="1"/>
+          <w:sz w:val="34"/>
+          <w:szCs w:val="34"/>
+          <w:rtl w:val="0"/>
+        </w:rPr>
+        <w:t xml:space="preserve">4. Configuração do Banco de Dados</w:t>
+      </w:r>
+    </w:p>
+    <w:p>
+      <w:pPr>
+        <w:spacing w:after="240" w:before="240" w:lineRule="auto"/>
+        <w:rPr/>
+      </w:pPr>
+      <w:r>
+        <w:rPr>
+          <w:rtl w:val="0"/>
+        </w:rPr>
+        <w:t xml:space="preserve">O sistema utiliza um banco de dados relacional MySQL. A configuração da conexão é realizada por meio de variáveis de ambiente, definidas em um arquivo </w:t>
+      </w:r>
+      <w:r>
+        <w:rPr>
+          <w:rFonts w:ascii="Roboto Mono" w:cs="Roboto Mono" w:eastAsia="Roboto Mono" w:hAnsi="Roboto Mono"/>
+          <w:color w:val="188038"/>
+          <w:rtl w:val="0"/>
+        </w:rPr>
+        <w:t xml:space="preserve">.env</w:t>
+      </w:r>
+      <w:r>
+        <w:rPr>
+          <w:rtl w:val="0"/>
+        </w:rPr>
+        <w:t xml:space="preserve"> localizado na raiz da API principal.</w:t>
+      </w:r>
+    </w:p>
+    <w:p>
+      <w:pPr>
+        <w:spacing w:after="240" w:before="240" w:lineRule="auto"/>
+        <w:rPr/>
+      </w:pPr>
+      <w:r>
+        <w:rPr>
+          <w:rtl w:val="0"/>
+        </w:rPr>
+        <w:t xml:space="preserve">Durante a inicialização da aplicação, a estrutura do banco é gerenciada através de </w:t>
+      </w:r>
+      <w:r>
+        <w:rPr>
+          <w:b w:val="1"/>
+          <w:bCs w:val="1"/>
+          <w:rtl w:val="0"/>
+        </w:rPr>
+        <w:t xml:space="preserve">Knex Migrations</w:t>
+      </w:r>
+      <w:r>
+        <w:rPr>
+          <w:rtl w:val="0"/>
+        </w:rPr>
+        <w:t xml:space="preserve">, responsáveis pelo versionamento das alterações do esquema.</w:t>
+      </w:r>
+    </w:p>
+    <w:p>
+      <w:pPr>
+        <w:spacing w:after="240" w:before="240" w:lineRule="auto"/>
+        <w:rPr/>
+      </w:pPr>
+      <w:r>
+        <w:rPr>
+          <w:rtl w:val="0"/>
+        </w:rPr>
+        <w:t xml:space="preserve">Os dados iniciais são gerenciados através de </w:t>
+      </w:r>
+      <w:r>
+        <w:rPr>
+          <w:b w:val="1"/>
+          <w:bCs w:val="1"/>
+          <w:rtl w:val="0"/>
+        </w:rPr>
+        <w:t xml:space="preserve">Knex Seeds</w:t>
+      </w:r>
+      <w:r>
+        <w:rPr>
+          <w:rtl w:val="0"/>
+        </w:rPr>
+        <w:t xml:space="preserve">.</w:t>
+      </w:r>
+      <w:r>
+        <w:rPr>
+          <w:rtl w:val="0"/>
+        </w:rPr>
+      </w:r>
+    </w:p>
+    <w:p>
+      <w:pPr>
+        <w:spacing w:after="240" w:before="240" w:lineRule="auto"/>
+        <w:rPr/>
+      </w:pPr>
+      <w:r>
+        <w:rPr>
+          <w:rtl w:val="0"/>
+        </w:rPr>
+        <w:t xml:space="preserve">As migrations e seeds permitem reproduzir e controlar a evolução do banco de dados sem depender da execução manual de scripts SQL. </w:t>
+      </w:r>
+    </w:p>
+    <w:p>
+      <w:pPr>
+        <w:spacing w:after="240" w:before="240" w:lineRule="auto"/>
+        <w:rPr/>
+      </w:pPr>
+      <w:r>
+        <w:rPr>
+          <w:rtl w:val="0"/>
+        </w:rPr>
+        <w:t xml:space="preserve">As </w:t>
+      </w:r>
+      <w:r>
+        <w:rPr>
+          <w:b w:val="1"/>
+          <w:bCs w:val="1"/>
+          <w:rtl w:val="0"/>
+        </w:rPr>
+        <w:t xml:space="preserve">views</w:t>
+      </w:r>
+      <w:r>
+        <w:rPr>
+          <w:rtl w:val="0"/>
+        </w:rPr>
+        <w:t xml:space="preserve"> utilizadas pela aplicação são criadas e mantidas de acordo com a estrutura definida para o banco.</w:t>
+      </w:r>
+    </w:p>
+    <w:p>
+      <w:pPr>
+        <w:pStyle w:val="Heading2"/>
+        <w:keepNext w:val="0"/>
+        <w:keepLines w:val="0"/>
+        <w:spacing w:after="80" w:lineRule="auto"/>
+        <w:rPr>
+          <w:b w:val="1"/>
+          <w:bCs w:val="1"/>
+          <w:sz w:val="34"/>
+          <w:szCs w:val="34"/>
+        </w:rPr>
+      </w:pPr>
+      <w:bookmarkStart w:colFirst="0" w:colLast="0" w:name="_38gif0ka0ier" w:id="8"/>
+      <w:bookmarkEnd w:id="8"/>
+      <w:r>
+        <w:rPr>
+          <w:b w:val="1"/>
+          <w:bCs w:val="1"/>
+          <w:sz w:val="34"/>
+          <w:szCs w:val="34"/>
+          <w:rtl w:val="0"/>
+        </w:rPr>
+        <w:t xml:space="preserve">5. Execução da Aplicação</w:t>
+      </w:r>
+    </w:p>
+    <w:p>
+      <w:pPr>
+        <w:spacing w:after="240" w:before="240" w:lineRule="auto"/>
+        <w:rPr/>
+      </w:pPr>
+      <w:r>
+        <w:rPr>
+          <w:rtl w:val="0"/>
+        </w:rPr>
+        <w:t xml:space="preserve">Após a configuração do ambiente e do banco de dados, o servidor pode ser iniciado em modo de produção ou desenvolvimento. O sistema suporta execução com Node.js padrão ou com nodemon para recarregamento automático durante o desenvolvimento.</w:t>
+      </w:r>
+    </w:p>
+    <w:p>
+      <w:pPr>
+        <w:spacing w:after="240" w:before="240" w:lineRule="auto"/>
+        <w:rPr/>
+      </w:pPr>
+      <w:r>
+        <w:rPr>
+          <w:rtl w:val="0"/>
+        </w:rPr>
+        <w:t xml:space="preserve">Ao iniciar, a API ficará disponível para consumo via HTTP, respeitando as rotas e regras de segurança configuradas.</w:t>
+      </w:r>
+    </w:p>
+    <w:p>
+      <w:pPr>
+        <w:pStyle w:val="Heading2"/>
+        <w:keepNext w:val="0"/>
+        <w:keepLines w:val="0"/>
+        <w:spacing w:after="80" w:lineRule="auto"/>
+        <w:rPr>
+          <w:b w:val="1"/>
+          <w:bCs w:val="1"/>
+          <w:sz w:val="34"/>
+          <w:szCs w:val="34"/>
+        </w:rPr>
+      </w:pPr>
+      <w:bookmarkStart w:colFirst="0" w:colLast="0" w:name="_bk1l7ps90h2g" w:id="9"/>
+      <w:bookmarkEnd w:id="9"/>
+      <w:r>
+        <w:rPr>
+          <w:b w:val="1"/>
+          <w:bCs w:val="1"/>
+          <w:sz w:val="34"/>
+          <w:szCs w:val="34"/>
+          <w:rtl w:val="0"/>
+        </w:rPr>
+        <w:t xml:space="preserve">6. Estrutura de Pastas</w:t>
+      </w:r>
+    </w:p>
+    <w:p>
+      <w:pPr>
+        <w:spacing w:after="240" w:before="240" w:lineRule="auto"/>
+        <w:rPr/>
+      </w:pPr>
+      <w:r>
+        <w:rPr>
+          <w:rtl w:val="0"/>
+        </w:rPr>
+        <w:t xml:space="preserve">A API principal segue uma estrutura modular organizada da seguinte forma:</w:t>
+      </w:r>
+    </w:p>
+    <w:p>
+      <w:pPr>
+        <w:numPr>
+          <w:ilvl w:val="0"/>
+          <w:numId w:val="11"/>
+        </w:numPr>
+        <w:spacing w:after="0" w:afterAutospacing="0" w:before="240" w:lineRule="auto"/>
+        <w:ind w:left="720" w:hanging="360"/>
+      </w:pPr>
+      <w:r>
+        <w:rPr>
+          <w:rtl w:val="0"/>
+        </w:rPr>
+        <w:t xml:space="preserve">A pasta </w:t>
+      </w:r>
+      <w:r>
+        <w:rPr>
+          <w:rFonts w:ascii="Roboto Mono" w:cs="Roboto Mono" w:eastAsia="Roboto Mono" w:hAnsi="Roboto Mono"/>
+          <w:color w:val="188038"/>
+          <w:rtl w:val="0"/>
+        </w:rPr>
+        <w:t xml:space="preserve">modules</w:t>
+      </w:r>
+      <w:r>
+        <w:rPr>
+          <w:rtl w:val="0"/>
+        </w:rPr>
+        <w:t xml:space="preserve"> contém os módulos de domínio do sistema, como usuários, secretarias, associações, produtos e movimentações.</w:t>
+        <w:br w:type="textWrapping"/>
+      </w:r>
+    </w:p>
+    <w:p>
+      <w:pPr>
+        <w:numPr>
+          <w:ilvl w:val="0"/>
+          <w:numId w:val="11"/>
+        </w:numPr>
+        <w:spacing w:after="0" w:afterAutospacing="0" w:before="0" w:beforeAutospacing="0" w:lineRule="auto"/>
+        <w:ind w:left="720" w:hanging="360"/>
+      </w:pPr>
+      <w:r>
+        <w:rPr>
+          <w:rtl w:val="0"/>
+        </w:rPr>
+        <w:t xml:space="preserve">A pasta </w:t>
+      </w:r>
+      <w:r>
+        <w:rPr>
+          <w:rFonts w:ascii="Roboto Mono" w:cs="Roboto Mono" w:eastAsia="Roboto Mono" w:hAnsi="Roboto Mono"/>
+          <w:color w:val="188038"/>
+          <w:rtl w:val="0"/>
+        </w:rPr>
+        <w:t xml:space="preserve">shared</w:t>
+      </w:r>
+      <w:r>
+        <w:rPr>
+          <w:rtl w:val="0"/>
+        </w:rPr>
+        <w:t xml:space="preserve"> concentra recursos reutilizáveis, como classes base, utilitários, validações e políticas de acesso.</w:t>
+        <w:br w:type="textWrapping"/>
+      </w:r>
+    </w:p>
+    <w:p>
+      <w:pPr>
+        <w:numPr>
+          <w:ilvl w:val="0"/>
+          <w:numId w:val="11"/>
+        </w:numPr>
+        <w:spacing w:after="0" w:afterAutospacing="0" w:before="0" w:beforeAutospacing="0" w:lineRule="auto"/>
+        <w:ind w:left="720" w:hanging="360"/>
+      </w:pPr>
+      <w:r>
+        <w:rPr>
+          <w:rtl w:val="0"/>
+        </w:rPr>
+        <w:t xml:space="preserve">A pasta </w:t>
+      </w:r>
+      <w:r>
+        <w:rPr>
+          <w:rFonts w:ascii="Roboto Mono" w:cs="Roboto Mono" w:eastAsia="Roboto Mono" w:hAnsi="Roboto Mono"/>
+          <w:color w:val="188038"/>
+          <w:rtl w:val="0"/>
+        </w:rPr>
+        <w:t xml:space="preserve">database</w:t>
+      </w:r>
+      <w:r>
+        <w:rPr>
+          <w:rtl w:val="0"/>
+        </w:rPr>
+        <w:t xml:space="preserve"> contém arquivos relacionados à conexão com o banco de dados.</w:t>
+        <w:br w:type="textWrapping"/>
+      </w:r>
+    </w:p>
+    <w:p>
+      <w:pPr>
+        <w:numPr>
+          <w:ilvl w:val="0"/>
+          <w:numId w:val="11"/>
+        </w:numPr>
+        <w:spacing w:after="240" w:before="0" w:beforeAutospacing="0" w:lineRule="auto"/>
+        <w:ind w:left="720" w:hanging="360"/>
+      </w:pPr>
+      <w:r>
+        <w:rPr>
+          <w:rtl w:val="0"/>
+        </w:rPr>
+        <w:t xml:space="preserve">A pasta </w:t>
+      </w:r>
+      <w:r>
+        <w:rPr>
+          <w:rFonts w:ascii="Roboto Mono" w:cs="Roboto Mono" w:eastAsia="Roboto Mono" w:hAnsi="Roboto Mono"/>
+          <w:color w:val="188038"/>
+          <w:rtl w:val="0"/>
+        </w:rPr>
+        <w:t xml:space="preserve">config</w:t>
+      </w:r>
+      <w:r>
+        <w:rPr>
+          <w:rtl w:val="0"/>
+        </w:rPr>
+        <w:t xml:space="preserve"> armazena configurações globais da aplicação.</w:t>
+        <w:br w:type="textWrapping"/>
+      </w:r>
+    </w:p>
+    <w:p>
+      <w:pPr>
+        <w:spacing w:after="240" w:before="240" w:lineRule="auto"/>
+        <w:rPr/>
+      </w:pPr>
+      <w:r>
+        <w:rPr>
+          <w:rtl w:val="0"/>
+        </w:rPr>
+        <w:t xml:space="preserve">Essa organização promove alta coesão e baixo acoplamento entre os componentes.</w:t>
+      </w:r>
+    </w:p>
+    <w:p>
+      <w:pPr>
+        <w:pStyle w:val="Heading2"/>
+        <w:keepNext w:val="0"/>
+        <w:keepLines w:val="0"/>
+        <w:spacing w:after="80" w:lineRule="auto"/>
+        <w:rPr>
+          <w:b w:val="1"/>
+          <w:bCs w:val="1"/>
+          <w:sz w:val="34"/>
+          <w:szCs w:val="34"/>
+        </w:rPr>
+      </w:pPr>
+      <w:bookmarkStart w:colFirst="0" w:colLast="0" w:name="_l300ylsj9149" w:id="10"/>
+      <w:bookmarkEnd w:id="10"/>
+      <w:r>
+        <w:rPr>
+          <w:b w:val="1"/>
+          <w:bCs w:val="1"/>
+          <w:sz w:val="34"/>
+          <w:szCs w:val="34"/>
+          <w:rtl w:val="0"/>
+        </w:rPr>
+        <w:t xml:space="preserve">7. Arquitetura e Padrão de Desenvolvimento</w:t>
+      </w:r>
+    </w:p>
+    <w:p>
+      <w:pPr>
+        <w:spacing w:after="240" w:before="240" w:lineRule="auto"/>
+        <w:rPr/>
+      </w:pPr>
+      <w:r>
+        <w:rPr>
+          <w:rtl w:val="0"/>
+        </w:rPr>
+        <w:t xml:space="preserve">O sistema adota uma arquitetura monolítica modular baseada no padrão Layered Architecture. As camadas são bem definidas:</w:t>
       </w:r>
     </w:p>
     <w:p>
@@ -164,9 +781,17 @@
       </w:pPr>
       <w:r>
         <w:rPr>
-          <w:rtl w:val="0"/>
-        </w:rPr>
-        <w:t xml:space="preserve">Node.js versão 14 ou superior</w:t>
+          <w:b w:val="1"/>
+          <w:bCs w:val="1"/>
+          <w:rtl w:val="0"/>
+        </w:rPr>
+        <w:t xml:space="preserve">Controllers: </w:t>
+      </w:r>
+      <w:r>
+        <w:rPr>
+          <w:rtl w:val="0"/>
+        </w:rPr>
+        <w:t xml:space="preserve">responsáveis pelo fluxo HTTP, recebimento das requisições e construção das respostas.</w:t>
         <w:br w:type="textWrapping"/>
       </w:r>
     </w:p>
@@ -181,9 +806,17 @@
       </w:pPr>
       <w:r>
         <w:rPr>
-          <w:rtl w:val="0"/>
-        </w:rPr>
-        <w:t xml:space="preserve">MySQL (ou banco de dados relacional compatível)</w:t>
+          <w:b w:val="1"/>
+          <w:bCs w:val="1"/>
+          <w:rtl w:val="0"/>
+        </w:rPr>
+        <w:t xml:space="preserve">Services</w:t>
+      </w:r>
+      <w:r>
+        <w:rPr>
+          <w:rtl w:val="0"/>
+        </w:rPr>
+        <w:t xml:space="preserve">: concentram as regras de negócio, validações e orquestração das operações.</w:t>
         <w:br w:type="textWrapping"/>
       </w:r>
     </w:p>
@@ -198,9 +831,67 @@
       </w:pPr>
       <w:r>
         <w:rPr>
-          <w:rtl w:val="0"/>
-        </w:rPr>
-        <w:t xml:space="preserve">Gerenciador de pacotes NPM ou Yarn</w:t>
+          <w:b w:val="1"/>
+          <w:bCs w:val="1"/>
+          <w:rtl w:val="0"/>
+        </w:rPr>
+        <w:t xml:space="preserve">Repositories:</w:t>
+      </w:r>
+      <w:r>
+        <w:rPr>
+          <w:rtl w:val="0"/>
+        </w:rPr>
+        <w:t xml:space="preserve"> encapsulam o acesso ao banco de dados e as consultas realizadas através do Knex.</w:t>
+        <w:br w:type="textWrapping"/>
+      </w:r>
+    </w:p>
+    <w:p>
+      <w:pPr>
+        <w:numPr>
+          <w:ilvl w:val="0"/>
+          <w:numId w:val="6"/>
+        </w:numPr>
+        <w:spacing w:after="0" w:afterAutospacing="0" w:before="0" w:beforeAutospacing="0" w:lineRule="auto"/>
+        <w:ind w:left="720" w:hanging="360"/>
+      </w:pPr>
+      <w:r>
+        <w:rPr>
+          <w:b w:val="1"/>
+          <w:bCs w:val="1"/>
+          <w:rtl w:val="0"/>
+        </w:rPr>
+        <w:t xml:space="preserve">Policies</w:t>
+      </w:r>
+      <w:r>
+        <w:rPr>
+          <w:rtl w:val="0"/>
+        </w:rPr>
+        <w:t xml:space="preserve">: implementam as regras de autorização baseadas no nível de acesso do usuário</w:t>
+        <w:br w:type="textWrapping"/>
+      </w:r>
+    </w:p>
+    <w:p>
+      <w:pPr>
+        <w:numPr>
+          <w:ilvl w:val="0"/>
+          <w:numId w:val="6"/>
+        </w:numPr>
+        <w:spacing w:after="0" w:afterAutospacing="0" w:before="0" w:beforeAutospacing="0" w:lineRule="auto"/>
+        <w:ind w:left="720" w:hanging="360"/>
+      </w:pPr>
+      <w:r>
+        <w:rPr>
+          <w:b w:val="1"/>
+          <w:bCs w:val="1"/>
+          <w:rtl w:val="0"/>
+        </w:rPr>
+        <w:t xml:space="preserve">Services</w:t>
+      </w:r>
+      <w:r>
+        <w:rPr>
+          <w:rtl w:val="0"/>
+        </w:rPr>
+        <w:t xml:space="preserve">: concentram as regras de negócio, validações e orquestração das operações.</w:t>
         <w:br w:type="textWrapping"/>
       </w:r>
     </w:p>
@@ -215,100 +906,69 @@
       </w:pPr>
       <w:r>
         <w:rPr>
-          <w:rtl w:val="0"/>
-        </w:rPr>
-        <w:t xml:space="preserve">Ferramentas de teste de API, como Insomnia ou Postman</w:t>
+          <w:b w:val="1"/>
+          <w:bCs w:val="1"/>
+          <w:rtl w:val="0"/>
+        </w:rPr>
+        <w:t xml:space="preserve">BaseScope</w:t>
+      </w:r>
+      <w:r>
+        <w:rPr>
+          <w:rtl w:val="0"/>
+        </w:rPr>
+        <w:t xml:space="preserve">: Responsável pela aplicação dos filtros de escopo diretamente nas consultas ao banco de dados. O </w:t>
+      </w:r>
+      <w:r>
+        <w:rPr>
+          <w:b w:val="1"/>
+          <w:bCs w:val="1"/>
+          <w:rtl w:val="0"/>
+        </w:rPr>
+        <w:t xml:space="preserve">BaseScope</w:t>
+      </w:r>
+      <w:r>
+        <w:rPr>
+          <w:rtl w:val="0"/>
+        </w:rPr>
+        <w:t xml:space="preserve"> substitui a abordagem anterior em que os dados eram consultados e filtrados posteriormente pelo </w:t>
+      </w:r>
+      <w:r>
+        <w:rPr>
+          <w:b w:val="1"/>
+          <w:bCs w:val="1"/>
+          <w:rtl w:val="0"/>
+        </w:rPr>
+        <w:t xml:space="preserve">BaseService</w:t>
+      </w:r>
+      <w:r>
+        <w:rPr>
+          <w:rtl w:val="0"/>
+        </w:rPr>
+        <w:t xml:space="preserve">. Essa mudança reduz o volume de dados retornados e processados pela aplicação</w:t>
+      </w:r>
+      <w:r>
+        <w:rPr>
+          <w:rtl w:val="0"/>
+        </w:rPr>
+        <w:t xml:space="preserve">.</w:t>
         <w:br w:type="textWrapping"/>
       </w:r>
-    </w:p>
-    <w:p>
-      <w:pPr>
-        <w:pStyle w:val="Heading3"/>
-        <w:keepNext w:val="0"/>
-        <w:keepLines w:val="0"/>
-        <w:spacing w:before="280" w:lineRule="auto"/>
-        <w:rPr>
-          <w:b w:val="1"/>
-          <w:bCs w:val="1"/>
-          <w:color w:val="000000"/>
-          <w:sz w:val="26"/>
-          <w:szCs w:val="26"/>
-        </w:rPr>
-      </w:pPr>
-      <w:bookmarkStart w:colFirst="0" w:colLast="0" w:name="_8riwmobplt7a" w:id="5"/>
-      <w:bookmarkEnd w:id="5"/>
-      <w:r>
-        <w:rPr>
-          <w:b w:val="1"/>
-          <w:bCs w:val="1"/>
-          <w:color w:val="000000"/>
-          <w:sz w:val="26"/>
-          <w:szCs w:val="26"/>
-          <w:rtl w:val="0"/>
-        </w:rPr>
-        <w:t xml:space="preserve">2.2 Requisitos de Ambiente</w:t>
-      </w:r>
-    </w:p>
-    <w:p>
-      <w:pPr>
-        <w:numPr>
-          <w:ilvl w:val="0"/>
-          <w:numId w:val="11"/>
-        </w:numPr>
-        <w:spacing w:after="0" w:afterAutospacing="0" w:before="240" w:lineRule="auto"/>
-        <w:ind w:left="720" w:hanging="360"/>
-      </w:pPr>
-      <w:r>
-        <w:rPr>
-          <w:rtl w:val="0"/>
-        </w:rPr>
-        <w:t xml:space="preserve">Sistema operacional Windows, Linux ou macOS</w:t>
-        <w:br w:type="textWrapping"/>
-      </w:r>
-    </w:p>
-    <w:p>
-      <w:pPr>
-        <w:numPr>
-          <w:ilvl w:val="0"/>
-          <w:numId w:val="11"/>
-        </w:numPr>
-        <w:spacing w:after="0" w:afterAutospacing="0" w:before="0" w:beforeAutospacing="0" w:lineRule="auto"/>
-        <w:ind w:left="720" w:hanging="360"/>
-      </w:pPr>
-      <w:r>
-        <w:rPr>
-          <w:rtl w:val="0"/>
-        </w:rPr>
-        <w:t xml:space="preserve">Acesso a terminal ou prompt de comando</w:t>
-        <w:br w:type="textWrapping"/>
-      </w:r>
-    </w:p>
-    <w:p>
-      <w:pPr>
-        <w:numPr>
-          <w:ilvl w:val="0"/>
-          <w:numId w:val="11"/>
-        </w:numPr>
-        <w:spacing w:after="240" w:before="0" w:beforeAutospacing="0" w:lineRule="auto"/>
-        <w:ind w:left="720" w:hanging="360"/>
-      </w:pPr>
-      <w:r>
-        <w:rPr>
-          <w:rtl w:val="0"/>
-        </w:rPr>
-        <w:t xml:space="preserve">Permissões para criação e manipulação de banco de dados MySQL</w:t>
-        <w:br w:type="textWrapping"/>
-      </w:r>
-    </w:p>
-    <w:p>
-      <w:pPr>
-        <w:spacing w:after="240" w:before="240" w:lineRule="auto"/>
-        <w:rPr/>
-      </w:pPr>
-      <w:r>
-        <w:rPr>
-          <w:rtl w:val="0"/>
-        </w:rPr>
+      <w:r>
+        <w:rPr>
+          <w:rtl w:val="0"/>
+        </w:rPr>
+      </w:r>
+    </w:p>
+    <w:p>
+      <w:pPr>
+        <w:spacing w:after="240" w:before="240" w:lineRule="auto"/>
+        <w:rPr/>
+      </w:pPr>
+      <w:r>
+        <w:rPr>
+          <w:rtl w:val="0"/>
+        </w:rPr>
+        <w:t xml:space="preserve">Esse padrão garante clareza, manutenibilidade e segurança no desenvolvimento.</w:t>
       </w:r>
     </w:p>
     <w:p>
@@ -324,8 +984,8 @@
           <w:szCs w:val="34"/>
         </w:rPr>
       </w:pPr>
-      <w:bookmarkStart w:colFirst="0" w:colLast="0" w:name="_b64vvry82e5t" w:id="6"/>
-      <w:bookmarkEnd w:id="6"/>
+      <w:bookmarkStart w:colFirst="0" w:colLast="0" w:name="_oson55hdof8t" w:id="11"/>
+      <w:bookmarkEnd w:id="11"/>
       <w:r>
         <w:rPr>
           <w:b w:val="1"/>
@@ -334,31 +994,1048 @@
           <w:szCs w:val="34"/>
           <w:rtl w:val="0"/>
         </w:rPr>
-        <w:t xml:space="preserve">3. Instalação do Sistema</w:t>
-      </w:r>
-    </w:p>
-    <w:p>
-      <w:pPr>
-        <w:spacing w:after="240" w:before="240" w:lineRule="auto"/>
-        <w:rPr/>
-      </w:pPr>
-      <w:r>
-        <w:rPr>
-          <w:rtl w:val="0"/>
-        </w:rPr>
-        <w:t xml:space="preserve">Inicialmente, deve-se clonar o repositório oficial do projeto e acessar a pasta da API principal. Em seguida, as dependências do projeto devem ser instaladas utilizando o gerenciador de pacotes escolhido.</w:t>
-      </w:r>
-    </w:p>
-    <w:p>
-      <w:pPr>
-        <w:spacing w:after="240" w:before="240" w:lineRule="auto"/>
-        <w:rPr/>
-      </w:pPr>
-      <w:r>
-        <w:rPr>
-          <w:rtl w:val="0"/>
-        </w:rPr>
-        <w:t xml:space="preserve">Após a instalação das dependências, o ambiente estará preparado para a configuração do banco de dados e execução da aplicação.</w:t>
+        <w:t xml:space="preserve">8. Autenticação e Segurança</w:t>
+      </w:r>
+    </w:p>
+    <w:p>
+      <w:pPr>
+        <w:spacing w:after="240" w:before="240" w:lineRule="auto"/>
+        <w:rPr/>
+      </w:pPr>
+      <w:r>
+        <w:rPr>
+          <w:rtl w:val="0"/>
+        </w:rPr>
+        <w:t xml:space="preserve">O sistema utiliza autenticação baseada em</w:t>
+      </w:r>
+      <w:r>
+        <w:rPr>
+          <w:b w:val="1"/>
+          <w:bCs w:val="1"/>
+          <w:rtl w:val="0"/>
+        </w:rPr>
+        <w:t xml:space="preserve"> JWT (JSON Web Token)</w:t>
+      </w:r>
+      <w:r>
+        <w:rPr>
+          <w:rtl w:val="0"/>
+        </w:rPr>
+        <w:t xml:space="preserve">, permitindo sessões stateless e seguras. Os tokens possuem validade de sete dias e carregam informações essenciais para autorização, como nível de acesso e vínculo institucional.</w:t>
+      </w:r>
+    </w:p>
+    <w:p>
+      <w:pPr>
+        <w:spacing w:after="240" w:before="240" w:lineRule="auto"/>
+        <w:rPr/>
+      </w:pPr>
+      <w:r>
+        <w:rPr>
+          <w:rtl w:val="0"/>
+        </w:rPr>
+        <w:t xml:space="preserve">As senhas são armazenadas de forma criptografada utilizando bcrypt, com uso de salt para aumentar a segurança.</w:t>
+      </w:r>
+    </w:p>
+    <w:p>
+      <w:pPr>
+        <w:pStyle w:val="Heading3"/>
+        <w:keepNext w:val="0"/>
+        <w:keepLines w:val="0"/>
+        <w:rPr>
+          <w:b w:val="1"/>
+          <w:bCs w:val="1"/>
+          <w:color w:val="000000"/>
+        </w:rPr>
+      </w:pPr>
+      <w:bookmarkStart w:colFirst="0" w:colLast="0" w:name="_o5lseg5tbh4o" w:id="12"/>
+      <w:bookmarkEnd w:id="12"/>
+      <w:r>
+        <w:rPr>
+          <w:b w:val="1"/>
+          <w:bCs w:val="1"/>
+          <w:color w:val="000000"/>
+          <w:rtl w:val="0"/>
+        </w:rPr>
+        <w:t xml:space="preserve">8.1 Tratamento de Senhas em Texto (Legacy Passwords)</w:t>
+      </w:r>
+    </w:p>
+    <w:p>
+      <w:pPr>
+        <w:spacing w:after="240" w:before="240" w:lineRule="auto"/>
+        <w:rPr/>
+      </w:pPr>
+      <w:r>
+        <w:rPr>
+          <w:rtl w:val="0"/>
+        </w:rPr>
+        <w:t xml:space="preserve">O sistema oferece compatibilidade temporária com usuários cujas senhas foram armazenadas em texto simples em versões anteriores.</w:t>
+      </w:r>
+    </w:p>
+    <w:p>
+      <w:pPr>
+        <w:spacing w:after="240" w:before="240" w:lineRule="auto"/>
+        <w:rPr/>
+      </w:pPr>
+      <w:r>
+        <w:rPr>
+          <w:rtl w:val="0"/>
+        </w:rPr>
+        <w:t xml:space="preserve">Durante o login, caso a credencial legada seja validada com sucesso, a senha é imediatamente convertida para um</w:t>
+      </w:r>
+      <w:r>
+        <w:rPr>
+          <w:b w:val="1"/>
+          <w:bCs w:val="1"/>
+          <w:rtl w:val="0"/>
+        </w:rPr>
+        <w:t xml:space="preserve"> hash bcrypt</w:t>
+      </w:r>
+      <w:r>
+        <w:rPr>
+          <w:rtl w:val="0"/>
+        </w:rPr>
+        <w:t xml:space="preserve"> e atualizada no banco.</w:t>
+      </w:r>
+    </w:p>
+    <w:p>
+      <w:pPr>
+        <w:spacing w:after="240" w:before="240" w:lineRule="auto"/>
+        <w:rPr/>
+      </w:pPr>
+      <w:r>
+        <w:rPr>
+          <w:rtl w:val="0"/>
+        </w:rPr>
+        <w:t xml:space="preserve">Essa estratégia permite realizar uma migração gradual das credenciais legadas, reduzindo a exposição associada ao armazenamento em texto simples sem exigir uma migração manual de todos os usuários.</w:t>
+      </w:r>
+    </w:p>
+    <w:p>
+      <w:pPr>
+        <w:spacing w:after="240" w:before="240" w:lineRule="auto"/>
+        <w:rPr/>
+      </w:pPr>
+      <w:r>
+        <w:rPr>
+          <w:rtl w:val="0"/>
+        </w:rPr>
+        <w:t xml:space="preserve">No processo de login, o sistema recupera as credenciais do usuário e verifica se o valor armazenado no campo de senha está no formato de hash </w:t>
+      </w:r>
+      <w:r>
+        <w:rPr>
+          <w:b w:val="1"/>
+          <w:bCs w:val="1"/>
+          <w:rtl w:val="0"/>
+        </w:rPr>
+        <w:t xml:space="preserve">bcrypt</w:t>
+      </w:r>
+      <w:r>
+        <w:rPr>
+          <w:rtl w:val="0"/>
+        </w:rPr>
+        <w:t xml:space="preserve">. Essa verificação é feita dinamicamente durante a autenticação.</w:t>
+      </w:r>
+    </w:p>
+    <w:p>
+      <w:pPr>
+        <w:spacing w:after="240" w:before="240" w:lineRule="auto"/>
+        <w:rPr/>
+      </w:pPr>
+      <w:r>
+        <w:rPr>
+          <w:rtl w:val="0"/>
+        </w:rPr>
+        <w:t xml:space="preserve">Caso a senha </w:t>
+      </w:r>
+      <w:r>
+        <w:rPr>
+          <w:b w:val="1"/>
+          <w:bCs w:val="1"/>
+          <w:rtl w:val="0"/>
+        </w:rPr>
+        <w:t xml:space="preserve">não esteja criptografada</w:t>
+      </w:r>
+      <w:r>
+        <w:rPr>
+          <w:rtl w:val="0"/>
+        </w:rPr>
+        <w:t xml:space="preserve">, o sistema valida o acesso por comparação direta entre a senha informada e o valor armazenado. Após a validação bem-sucedida, </w:t>
+      </w:r>
+      <w:r>
+        <w:rPr>
+          <w:b w:val="1"/>
+          <w:bCs w:val="1"/>
+          <w:rtl w:val="0"/>
+        </w:rPr>
+        <w:t xml:space="preserve">a senha é automaticamente convertida</w:t>
+      </w:r>
+      <w:r>
+        <w:rPr>
+          <w:rtl w:val="0"/>
+        </w:rPr>
+        <w:t xml:space="preserve"> para o formato </w:t>
+      </w:r>
+      <w:r>
+        <w:rPr>
+          <w:b w:val="1"/>
+          <w:bCs w:val="1"/>
+          <w:rtl w:val="0"/>
+        </w:rPr>
+        <w:t xml:space="preserve">bcrypt</w:t>
+      </w:r>
+      <w:r>
+        <w:rPr>
+          <w:rtl w:val="0"/>
+        </w:rPr>
+        <w:t xml:space="preserve"> e atualizada no banco de dados, eliminando a necessidade de intervenção manual.</w:t>
+      </w:r>
+    </w:p>
+    <w:p>
+      <w:pPr>
+        <w:spacing w:after="240" w:before="240" w:lineRule="auto"/>
+        <w:rPr/>
+      </w:pPr>
+      <w:r>
+        <w:rPr>
+          <w:rtl w:val="0"/>
+        </w:rPr>
+        <w:t xml:space="preserve">Se a senha já estiver criptografada, a autenticação é realizada normalmente utilizando o mecanismo de comparação segura do </w:t>
+      </w:r>
+      <w:r>
+        <w:rPr>
+          <w:b w:val="1"/>
+          <w:bCs w:val="1"/>
+          <w:rtl w:val="0"/>
+        </w:rPr>
+        <w:t xml:space="preserve">bcrypt</w:t>
+      </w:r>
+      <w:r>
+        <w:rPr>
+          <w:rtl w:val="0"/>
+        </w:rPr>
+        <w:t xml:space="preserve">. Em ambos os cenários, o sistema mantém o mesmo fluxo de geração de token </w:t>
+      </w:r>
+      <w:r>
+        <w:rPr>
+          <w:b w:val="1"/>
+          <w:bCs w:val="1"/>
+          <w:rtl w:val="0"/>
+        </w:rPr>
+        <w:t xml:space="preserve">JWT </w:t>
+      </w:r>
+      <w:r>
+        <w:rPr>
+          <w:rtl w:val="0"/>
+        </w:rPr>
+        <w:t xml:space="preserve">e controle de acesso por nível e escopo.</w:t>
+      </w:r>
+    </w:p>
+    <w:p>
+      <w:pPr>
+        <w:spacing w:after="240" w:before="240" w:lineRule="auto"/>
+        <w:rPr>
+          <w:b w:val="1"/>
+          <w:bCs w:val="1"/>
+        </w:rPr>
+      </w:pPr>
+      <w:r>
+        <w:rPr>
+          <w:b w:val="1"/>
+          <w:bCs w:val="1"/>
+          <w:rtl w:val="0"/>
+        </w:rPr>
+        <w:t xml:space="preserve">Essa abordagem garante:</w:t>
+      </w:r>
+    </w:p>
+    <w:p>
+      <w:pPr>
+        <w:numPr>
+          <w:ilvl w:val="0"/>
+          <w:numId w:val="8"/>
+        </w:numPr>
+        <w:spacing w:after="0" w:afterAutospacing="0" w:before="240" w:lineRule="auto"/>
+        <w:ind w:left="720" w:hanging="360"/>
+        <w:rPr>
+          <w:u w:val="none"/>
+        </w:rPr>
+      </w:pPr>
+      <w:r>
+        <w:rPr>
+          <w:b w:val="1"/>
+          <w:bCs w:val="1"/>
+          <w:rtl w:val="0"/>
+        </w:rPr>
+        <w:t xml:space="preserve">Continuidade</w:t>
+      </w:r>
+      <w:r>
+        <w:rPr>
+          <w:rtl w:val="0"/>
+        </w:rPr>
+        <w:t xml:space="preserve"> do funcionamento do sistema;</w:t>
+      </w:r>
+    </w:p>
+    <w:p>
+      <w:pPr>
+        <w:numPr>
+          <w:ilvl w:val="0"/>
+          <w:numId w:val="8"/>
+        </w:numPr>
+        <w:spacing w:after="0" w:afterAutospacing="0" w:before="0" w:beforeAutospacing="0" w:lineRule="auto"/>
+        <w:ind w:left="720" w:hanging="360"/>
+        <w:rPr>
+          <w:u w:val="none"/>
+        </w:rPr>
+      </w:pPr>
+      <w:r>
+        <w:rPr>
+          <w:b w:val="1"/>
+          <w:bCs w:val="1"/>
+          <w:rtl w:val="0"/>
+        </w:rPr>
+        <w:t xml:space="preserve">Migração automática</w:t>
+      </w:r>
+      <w:r>
+        <w:rPr>
+          <w:rtl w:val="0"/>
+        </w:rPr>
+        <w:t xml:space="preserve"> para padrões modernos de segurança;</w:t>
+      </w:r>
+    </w:p>
+    <w:p>
+      <w:pPr>
+        <w:numPr>
+          <w:ilvl w:val="0"/>
+          <w:numId w:val="8"/>
+        </w:numPr>
+        <w:spacing w:after="0" w:afterAutospacing="0" w:before="0" w:beforeAutospacing="0" w:lineRule="auto"/>
+        <w:ind w:left="720" w:hanging="360"/>
+        <w:rPr>
+          <w:u w:val="none"/>
+        </w:rPr>
+      </w:pPr>
+      <w:r>
+        <w:rPr>
+          <w:b w:val="1"/>
+          <w:bCs w:val="1"/>
+          <w:rtl w:val="0"/>
+        </w:rPr>
+        <w:t xml:space="preserve">Redução de riscos</w:t>
+      </w:r>
+      <w:r>
+        <w:rPr>
+          <w:rtl w:val="0"/>
+        </w:rPr>
+        <w:t xml:space="preserve"> associados ao armazenamento de senhas em texto simples;</w:t>
+      </w:r>
+    </w:p>
+    <w:p>
+      <w:pPr>
+        <w:numPr>
+          <w:ilvl w:val="0"/>
+          <w:numId w:val="8"/>
+        </w:numPr>
+        <w:spacing w:after="240" w:before="0" w:beforeAutospacing="0" w:lineRule="auto"/>
+        <w:ind w:left="720" w:hanging="360"/>
+        <w:rPr>
+          <w:u w:val="none"/>
+        </w:rPr>
+      </w:pPr>
+      <w:r>
+        <w:rPr>
+          <w:b w:val="1"/>
+          <w:bCs w:val="1"/>
+          <w:rtl w:val="0"/>
+        </w:rPr>
+        <w:t xml:space="preserve">Facilidade de manutenção</w:t>
+      </w:r>
+      <w:r>
+        <w:rPr>
+          <w:rtl w:val="0"/>
+        </w:rPr>
+        <w:t xml:space="preserve"> e evolução do sistema.</w:t>
+      </w:r>
+    </w:p>
+    <w:p>
+      <w:pPr>
+        <w:pStyle w:val="Heading3"/>
+        <w:spacing w:after="240" w:before="240" w:lineRule="auto"/>
+        <w:rPr>
+          <w:b w:val="1"/>
+          <w:bCs w:val="1"/>
+          <w:color w:val="000000"/>
+        </w:rPr>
+      </w:pPr>
+      <w:bookmarkStart w:colFirst="0" w:colLast="0" w:name="_snqcjd8z3oe5" w:id="13"/>
+      <w:bookmarkEnd w:id="13"/>
+      <w:r>
+        <w:rPr>
+          <w:b w:val="1"/>
+          <w:bCs w:val="1"/>
+          <w:color w:val="000000"/>
+          <w:sz w:val="28"/>
+          <w:szCs w:val="28"/>
+          <w:rtl w:val="0"/>
+        </w:rPr>
+        <w:t xml:space="preserve">8.2 Rate Limiting</w:t>
+      </w:r>
+      <w:r>
+        <w:rPr>
+          <w:rtl w:val="0"/>
+        </w:rPr>
+      </w:r>
+    </w:p>
+    <w:p>
+      <w:pPr>
+        <w:rPr/>
+      </w:pPr>
+      <w:r>
+        <w:rPr>
+          <w:rtl w:val="0"/>
+        </w:rPr>
+        <w:t xml:space="preserve">A rota de login utiliza </w:t>
+      </w:r>
+      <w:r>
+        <w:rPr>
+          <w:b w:val="1"/>
+          <w:bCs w:val="1"/>
+          <w:rtl w:val="0"/>
+        </w:rPr>
+        <w:t xml:space="preserve">express-rate-limit</w:t>
+      </w:r>
+      <w:r>
+        <w:rPr>
+          <w:rtl w:val="0"/>
+        </w:rPr>
+        <w:t xml:space="preserve"> para limitar a quantidade de tentativas de autenticação em determinado intervalo.</w:t>
+      </w:r>
+    </w:p>
+    <w:p>
+      <w:pPr>
+        <w:rPr/>
+      </w:pPr>
+      <w:r>
+        <w:rPr>
+          <w:rtl w:val="0"/>
+        </w:rPr>
+      </w:r>
+    </w:p>
+    <w:p>
+      <w:pPr>
+        <w:rPr/>
+      </w:pPr>
+      <w:r>
+        <w:rPr>
+          <w:rtl w:val="0"/>
+        </w:rPr>
+        <w:t xml:space="preserve">O mecanismo reduz a exposição da API a tentativas automatizadas de autenticação e ataques de força bruta.</w:t>
+      </w:r>
+    </w:p>
+    <w:p>
+      <w:pPr>
+        <w:rPr/>
+      </w:pPr>
+      <w:r>
+        <w:rPr>
+          <w:rtl w:val="0"/>
+        </w:rPr>
+      </w:r>
+    </w:p>
+    <w:p>
+      <w:pPr>
+        <w:rPr/>
+      </w:pPr>
+      <w:r>
+        <w:rPr>
+          <w:rtl w:val="0"/>
+        </w:rPr>
+        <w:t xml:space="preserve">O rate limiter é aplicado especificamente ao processo de login, permitindo um controle mais rigoroso sobre operações de autenticação.</w:t>
+      </w:r>
+    </w:p>
+    <w:p>
+      <w:pPr>
+        <w:pStyle w:val="Heading3"/>
+        <w:spacing w:after="240" w:before="240" w:lineRule="auto"/>
+        <w:rPr>
+          <w:b w:val="1"/>
+          <w:bCs w:val="1"/>
+          <w:color w:val="000000"/>
+        </w:rPr>
+      </w:pPr>
+      <w:bookmarkStart w:colFirst="0" w:colLast="0" w:name="_txrm3g3cc95a" w:id="14"/>
+      <w:bookmarkEnd w:id="14"/>
+      <w:r>
+        <w:rPr>
+          <w:b w:val="1"/>
+          <w:bCs w:val="1"/>
+          <w:color w:val="000000"/>
+          <w:rtl w:val="0"/>
+        </w:rPr>
+        <w:t xml:space="preserve">8.3 Logs Estruturados</w:t>
+      </w:r>
+    </w:p>
+    <w:p>
+      <w:pPr>
+        <w:rPr/>
+      </w:pPr>
+      <w:r>
+        <w:rPr>
+          <w:rtl w:val="0"/>
+        </w:rPr>
+        <w:t xml:space="preserve">A aplicação utiliza </w:t>
+      </w:r>
+      <w:r>
+        <w:rPr>
+          <w:b w:val="1"/>
+          <w:bCs w:val="1"/>
+          <w:rtl w:val="0"/>
+        </w:rPr>
+        <w:t xml:space="preserve">Pino</w:t>
+      </w:r>
+      <w:r>
+        <w:rPr>
+          <w:rtl w:val="0"/>
+        </w:rPr>
+        <w:t xml:space="preserve"> e </w:t>
+      </w:r>
+      <w:r>
+        <w:rPr>
+          <w:b w:val="1"/>
+          <w:bCs w:val="1"/>
+          <w:rtl w:val="0"/>
+        </w:rPr>
+        <w:t xml:space="preserve">Pino HTTP</w:t>
+      </w:r>
+      <w:r>
+        <w:rPr>
+          <w:rtl w:val="0"/>
+        </w:rPr>
+        <w:t xml:space="preserve"> para geração de logs estruturados.</w:t>
+      </w:r>
+    </w:p>
+    <w:p>
+      <w:pPr>
+        <w:rPr/>
+      </w:pPr>
+      <w:r>
+        <w:rPr>
+          <w:rtl w:val="0"/>
+        </w:rPr>
+      </w:r>
+    </w:p>
+    <w:p>
+      <w:pPr>
+        <w:rPr/>
+      </w:pPr>
+      <w:r>
+        <w:rPr>
+          <w:rtl w:val="0"/>
+        </w:rPr>
+        <w:t xml:space="preserve">O sistema permite registrar informações sobre eventos e requisições da API de maneira padronizada, facilitando:</w:t>
+      </w:r>
+    </w:p>
+    <w:p>
+      <w:pPr>
+        <w:rPr/>
+      </w:pPr>
+      <w:r>
+        <w:rPr>
+          <w:rtl w:val="0"/>
+        </w:rPr>
+      </w:r>
+    </w:p>
+    <w:p>
+      <w:pPr>
+        <w:numPr>
+          <w:ilvl w:val="0"/>
+          <w:numId w:val="9"/>
+        </w:numPr>
+        <w:ind w:left="720" w:hanging="360"/>
+        <w:rPr>
+          <w:u w:val="none"/>
+        </w:rPr>
+      </w:pPr>
+      <w:r>
+        <w:rPr>
+          <w:rtl w:val="0"/>
+        </w:rPr>
+        <w:t xml:space="preserve">Diagnóstico de problemas;</w:t>
+      </w:r>
+    </w:p>
+    <w:p>
+      <w:pPr>
+        <w:numPr>
+          <w:ilvl w:val="0"/>
+          <w:numId w:val="9"/>
+        </w:numPr>
+        <w:ind w:left="720" w:hanging="360"/>
+        <w:rPr>
+          <w:u w:val="none"/>
+        </w:rPr>
+      </w:pPr>
+      <w:r>
+        <w:rPr>
+          <w:rtl w:val="0"/>
+        </w:rPr>
+        <w:t xml:space="preserve">Monitoramento;</w:t>
+      </w:r>
+    </w:p>
+    <w:p>
+      <w:pPr>
+        <w:numPr>
+          <w:ilvl w:val="0"/>
+          <w:numId w:val="9"/>
+        </w:numPr>
+        <w:ind w:left="720" w:hanging="360"/>
+        <w:rPr>
+          <w:u w:val="none"/>
+        </w:rPr>
+      </w:pPr>
+      <w:r>
+        <w:rPr>
+          <w:rtl w:val="0"/>
+        </w:rPr>
+        <w:t xml:space="preserve">Análise de comportamento da aplicação;</w:t>
+      </w:r>
+    </w:p>
+    <w:p>
+      <w:pPr>
+        <w:numPr>
+          <w:ilvl w:val="0"/>
+          <w:numId w:val="9"/>
+        </w:numPr>
+        <w:ind w:left="720" w:hanging="360"/>
+        <w:rPr>
+          <w:u w:val="none"/>
+        </w:rPr>
+      </w:pPr>
+      <w:r>
+        <w:rPr>
+          <w:rtl w:val="0"/>
+        </w:rPr>
+        <w:t xml:space="preserve">Auditoria;</w:t>
+      </w:r>
+    </w:p>
+    <w:p>
+      <w:pPr>
+        <w:numPr>
+          <w:ilvl w:val="0"/>
+          <w:numId w:val="9"/>
+        </w:numPr>
+        <w:ind w:left="720" w:hanging="360"/>
+        <w:rPr>
+          <w:u w:val="none"/>
+        </w:rPr>
+      </w:pPr>
+      <w:r>
+        <w:rPr>
+          <w:rtl w:val="0"/>
+        </w:rPr>
+        <w:t xml:space="preserve">Investigação de eventos de segurança.</w:t>
+      </w:r>
+    </w:p>
+    <w:p>
+      <w:pPr>
+        <w:rPr/>
+      </w:pPr>
+      <w:r>
+        <w:rPr>
+          <w:rtl w:val="0"/>
+        </w:rPr>
+      </w:r>
+    </w:p>
+    <w:p>
+      <w:pPr>
+        <w:rPr/>
+      </w:pPr>
+      <w:r>
+        <w:rPr>
+          <w:rtl w:val="0"/>
+        </w:rPr>
+        <w:t xml:space="preserve">Os arquivos de log são mantidos fora do controle de versão através do </w:t>
+      </w:r>
+      <w:r>
+        <w:rPr>
+          <w:b w:val="1"/>
+          <w:bCs w:val="1"/>
+          <w:rtl w:val="0"/>
+        </w:rPr>
+        <w:t xml:space="preserve">.gitignore</w:t>
+      </w:r>
+      <w:r>
+        <w:rPr>
+          <w:rtl w:val="0"/>
+        </w:rPr>
+        <w:t xml:space="preserve">.</w:t>
+      </w:r>
+    </w:p>
+    <w:p>
+      <w:pPr>
+        <w:rPr/>
+      </w:pPr>
+      <w:r>
+        <w:rPr>
+          <w:rtl w:val="0"/>
+        </w:rPr>
+      </w:r>
+    </w:p>
+    <w:p>
+      <w:pPr>
+        <w:pStyle w:val="Heading3"/>
+        <w:spacing w:after="240" w:before="240" w:lineRule="auto"/>
+        <w:rPr>
+          <w:b w:val="1"/>
+          <w:bCs w:val="1"/>
+          <w:color w:val="000000"/>
+        </w:rPr>
+      </w:pPr>
+      <w:bookmarkStart w:colFirst="0" w:colLast="0" w:name="_9af28u5hj6ox" w:id="15"/>
+      <w:bookmarkEnd w:id="15"/>
+      <w:r>
+        <w:rPr>
+          <w:b w:val="1"/>
+          <w:bCs w:val="1"/>
+          <w:color w:val="000000"/>
+          <w:rtl w:val="0"/>
+        </w:rPr>
+        <w:t xml:space="preserve">8.4 Camadas de Segurança</w:t>
+      </w:r>
+    </w:p>
+    <w:p>
+      <w:pPr>
+        <w:rPr/>
+      </w:pPr>
+      <w:r>
+        <w:rPr>
+          <w:rtl w:val="0"/>
+        </w:rPr>
+        <w:t xml:space="preserve">A API utiliza múltiplos mecanismos complementares:</w:t>
+      </w:r>
+    </w:p>
+    <w:p>
+      <w:pPr>
+        <w:rPr/>
+      </w:pPr>
+      <w:r>
+        <w:rPr>
+          <w:rtl w:val="0"/>
+        </w:rPr>
+      </w:r>
+    </w:p>
+    <w:p>
+      <w:pPr>
+        <w:numPr>
+          <w:ilvl w:val="0"/>
+          <w:numId w:val="13"/>
+        </w:numPr>
+        <w:ind w:left="720" w:hanging="360"/>
+        <w:rPr>
+          <w:u w:val="none"/>
+        </w:rPr>
+      </w:pPr>
+      <w:r>
+        <w:rPr>
+          <w:rtl w:val="0"/>
+        </w:rPr>
+        <w:t xml:space="preserve">Autenticação:</w:t>
+      </w:r>
+    </w:p>
+    <w:p>
+      <w:pPr>
+        <w:numPr>
+          <w:ilvl w:val="1"/>
+          <w:numId w:val="13"/>
+        </w:numPr>
+        <w:ind w:left="1440" w:hanging="360"/>
+        <w:rPr>
+          <w:u w:val="none"/>
+        </w:rPr>
+      </w:pPr>
+      <w:r>
+        <w:rPr>
+          <w:rtl w:val="0"/>
+        </w:rPr>
+        <w:t xml:space="preserve">   JWT</w:t>
+      </w:r>
+    </w:p>
+    <w:p>
+      <w:pPr>
+        <w:numPr>
+          <w:ilvl w:val="1"/>
+          <w:numId w:val="13"/>
+        </w:numPr>
+        <w:ind w:left="1440" w:hanging="360"/>
+        <w:rPr>
+          <w:u w:val="none"/>
+        </w:rPr>
+      </w:pPr>
+      <w:r>
+        <w:rPr>
+          <w:rtl w:val="0"/>
+        </w:rPr>
+        <w:t xml:space="preserve">   bcrypt</w:t>
+      </w:r>
+    </w:p>
+    <w:p>
+      <w:pPr>
+        <w:ind w:left="1440" w:firstLine="0"/>
+        <w:rPr/>
+      </w:pPr>
+      <w:r>
+        <w:rPr>
+          <w:rtl w:val="0"/>
+        </w:rPr>
+      </w:r>
+    </w:p>
+    <w:p>
+      <w:pPr>
+        <w:numPr>
+          <w:ilvl w:val="0"/>
+          <w:numId w:val="13"/>
+        </w:numPr>
+        <w:ind w:left="720" w:hanging="360"/>
+        <w:rPr>
+          <w:u w:val="none"/>
+        </w:rPr>
+      </w:pPr>
+      <w:r>
+        <w:rPr>
+          <w:rtl w:val="0"/>
+        </w:rPr>
+        <w:t xml:space="preserve">Autorização:</w:t>
+      </w:r>
+    </w:p>
+    <w:p>
+      <w:pPr>
+        <w:numPr>
+          <w:ilvl w:val="1"/>
+          <w:numId w:val="13"/>
+        </w:numPr>
+        <w:ind w:left="1440" w:hanging="360"/>
+        <w:rPr>
+          <w:u w:val="none"/>
+        </w:rPr>
+      </w:pPr>
+      <w:r>
+        <w:rPr>
+          <w:rtl w:val="0"/>
+        </w:rPr>
+        <w:t xml:space="preserve">   RBAC</w:t>
+      </w:r>
+    </w:p>
+    <w:p>
+      <w:pPr>
+        <w:numPr>
+          <w:ilvl w:val="1"/>
+          <w:numId w:val="13"/>
+        </w:numPr>
+        <w:ind w:left="1440" w:hanging="360"/>
+        <w:rPr>
+          <w:u w:val="none"/>
+        </w:rPr>
+      </w:pPr>
+      <w:r>
+        <w:rPr>
+          <w:rtl w:val="0"/>
+        </w:rPr>
+        <w:t xml:space="preserve">   Policies</w:t>
+      </w:r>
+    </w:p>
+    <w:p>
+      <w:pPr>
+        <w:ind w:left="720" w:firstLine="0"/>
+        <w:rPr/>
+      </w:pPr>
+      <w:r>
+        <w:rPr>
+          <w:rtl w:val="0"/>
+        </w:rPr>
+      </w:r>
+    </w:p>
+    <w:p>
+      <w:pPr>
+        <w:numPr>
+          <w:ilvl w:val="0"/>
+          <w:numId w:val="13"/>
+        </w:numPr>
+        <w:ind w:left="720" w:hanging="360"/>
+        <w:rPr>
+          <w:u w:val="none"/>
+        </w:rPr>
+      </w:pPr>
+      <w:r>
+        <w:rPr>
+          <w:rtl w:val="0"/>
+        </w:rPr>
+        <w:t xml:space="preserve">Controle de dados:</w:t>
+      </w:r>
+    </w:p>
+    <w:p>
+      <w:pPr>
+        <w:numPr>
+          <w:ilvl w:val="1"/>
+          <w:numId w:val="13"/>
+        </w:numPr>
+        <w:ind w:left="1440" w:hanging="360"/>
+        <w:rPr>
+          <w:u w:val="none"/>
+        </w:rPr>
+      </w:pPr>
+      <w:r>
+        <w:rPr>
+          <w:rtl w:val="0"/>
+        </w:rPr>
+        <w:t xml:space="preserve">   BaseScope</w:t>
+      </w:r>
+    </w:p>
+    <w:p>
+      <w:pPr>
+        <w:numPr>
+          <w:ilvl w:val="1"/>
+          <w:numId w:val="13"/>
+        </w:numPr>
+        <w:ind w:left="1440" w:hanging="360"/>
+        <w:rPr>
+          <w:u w:val="none"/>
+        </w:rPr>
+      </w:pPr>
+      <w:r>
+        <w:rPr>
+          <w:rtl w:val="0"/>
+        </w:rPr>
+        <w:t xml:space="preserve">   Escopo `own`</w:t>
+      </w:r>
+    </w:p>
+    <w:p>
+      <w:pPr>
+        <w:ind w:left="720" w:firstLine="0"/>
+        <w:rPr/>
+      </w:pPr>
+      <w:r>
+        <w:rPr>
+          <w:rtl w:val="0"/>
+        </w:rPr>
+      </w:r>
+    </w:p>
+    <w:p>
+      <w:pPr>
+        <w:numPr>
+          <w:ilvl w:val="0"/>
+          <w:numId w:val="13"/>
+        </w:numPr>
+        <w:ind w:left="720" w:hanging="360"/>
+        <w:rPr>
+          <w:u w:val="none"/>
+        </w:rPr>
+      </w:pPr>
+      <w:r>
+        <w:rPr>
+          <w:rtl w:val="0"/>
+        </w:rPr>
+        <w:t xml:space="preserve">Proteção contra abuso:</w:t>
+      </w:r>
+    </w:p>
+    <w:p>
+      <w:pPr>
+        <w:numPr>
+          <w:ilvl w:val="1"/>
+          <w:numId w:val="13"/>
+        </w:numPr>
+        <w:ind w:left="1440" w:hanging="360"/>
+        <w:rPr>
+          <w:u w:val="none"/>
+        </w:rPr>
+      </w:pPr>
+      <w:r>
+        <w:rPr>
+          <w:rtl w:val="0"/>
+        </w:rPr>
+        <w:t xml:space="preserve">   Rate Limiting</w:t>
+      </w:r>
+    </w:p>
+    <w:p>
+      <w:pPr>
+        <w:ind w:left="720" w:firstLine="0"/>
+        <w:rPr/>
+      </w:pPr>
+      <w:r>
+        <w:rPr>
+          <w:rtl w:val="0"/>
+        </w:rPr>
+      </w:r>
+    </w:p>
+    <w:p>
+      <w:pPr>
+        <w:numPr>
+          <w:ilvl w:val="0"/>
+          <w:numId w:val="13"/>
+        </w:numPr>
+        <w:ind w:left="720" w:hanging="360"/>
+        <w:rPr>
+          <w:u w:val="none"/>
+        </w:rPr>
+      </w:pPr>
+      <w:r>
+        <w:rPr>
+          <w:rtl w:val="0"/>
+        </w:rPr>
+        <w:t xml:space="preserve">Observabilidade:</w:t>
+      </w:r>
+    </w:p>
+    <w:p>
+      <w:pPr>
+        <w:numPr>
+          <w:ilvl w:val="1"/>
+          <w:numId w:val="13"/>
+        </w:numPr>
+        <w:ind w:left="1440" w:hanging="360"/>
+        <w:rPr>
+          <w:u w:val="none"/>
+        </w:rPr>
+      </w:pPr>
+      <w:r>
+        <w:rPr>
+          <w:rtl w:val="0"/>
+        </w:rPr>
+        <w:t xml:space="preserve">   Logs estruturados</w:t>
+      </w:r>
+    </w:p>
+    <w:p>
+      <w:pPr>
+        <w:numPr>
+          <w:ilvl w:val="1"/>
+          <w:numId w:val="13"/>
+        </w:numPr>
+        <w:ind w:left="1440" w:hanging="360"/>
+        <w:rPr>
+          <w:u w:val="none"/>
+        </w:rPr>
+      </w:pPr>
+      <w:r>
+        <w:rPr>
+          <w:rtl w:val="0"/>
+        </w:rPr>
+        <w:t xml:space="preserve">   Pino</w:t>
+      </w:r>
+    </w:p>
+    <w:p>
+      <w:pPr>
+        <w:numPr>
+          <w:ilvl w:val="1"/>
+          <w:numId w:val="13"/>
+        </w:numPr>
+        <w:ind w:left="1440" w:hanging="360"/>
+        <w:rPr>
+          <w:u w:val="none"/>
+        </w:rPr>
+      </w:pPr>
+      <w:r>
+        <w:rPr>
+          <w:rtl w:val="0"/>
+        </w:rPr>
+        <w:t xml:space="preserve">   Pino HTTP</w:t>
+      </w:r>
+      <w:r>
+        <w:rPr>
+          <w:rtl w:val="0"/>
+        </w:rPr>
       </w:r>
     </w:p>
     <w:p>
@@ -374,8 +2051,8 @@
           <w:szCs w:val="34"/>
         </w:rPr>
       </w:pPr>
-      <w:bookmarkStart w:colFirst="0" w:colLast="0" w:name="_y0838svg03nn" w:id="7"/>
-      <w:bookmarkEnd w:id="7"/>
+      <w:bookmarkStart w:colFirst="0" w:colLast="0" w:name="_tuvjccr7pku0" w:id="16"/>
+      <w:bookmarkEnd w:id="16"/>
       <w:r>
         <w:rPr>
           <w:b w:val="1"/>
@@ -384,66 +2061,58 @@
           <w:szCs w:val="34"/>
           <w:rtl w:val="0"/>
         </w:rPr>
-        <w:t xml:space="preserve">4. Configuração do Banco de Dados</w:t>
-      </w:r>
-    </w:p>
-    <w:p>
-      <w:pPr>
-        <w:spacing w:after="240" w:before="240" w:lineRule="auto"/>
-        <w:rPr/>
-      </w:pPr>
-      <w:r>
-        <w:rPr>
-          <w:rtl w:val="0"/>
-        </w:rPr>
-        <w:t xml:space="preserve">O sistema utiliza um banco de dados relacional MySQL. A configuração da conexão é realizada por meio de variáveis de ambiente, definidas em um arquivo </w:t>
-      </w:r>
-      <w:r>
-        <w:rPr>
-          <w:rFonts w:ascii="Roboto Mono" w:cs="Roboto Mono" w:eastAsia="Roboto Mono" w:hAnsi="Roboto Mono"/>
-          <w:color w:val="188038"/>
-          <w:rtl w:val="0"/>
-        </w:rPr>
-        <w:t xml:space="preserve">.env</w:t>
-      </w:r>
-      <w:r>
-        <w:rPr>
-          <w:rtl w:val="0"/>
-        </w:rPr>
-        <w:t xml:space="preserve"> localizado na raiz da API principal.</w:t>
-      </w:r>
-    </w:p>
-    <w:p>
-      <w:pPr>
-        <w:spacing w:after="240" w:before="240" w:lineRule="auto"/>
-        <w:rPr/>
-      </w:pPr>
-      <w:r>
-        <w:rPr>
-          <w:rtl w:val="0"/>
-        </w:rPr>
-        <w:t xml:space="preserve">Durante a inicialização da aplicação, o sistema verifica a existência do banco de dados e de seus objetos, realizando automaticamente a criação da estrutura necessária, a inserção dos dados iniciais e a criação das </w:t>
-      </w:r>
-      <w:r>
-        <w:rPr>
-          <w:i w:val="1"/>
-          <w:iCs w:val="1"/>
-          <w:rtl w:val="0"/>
-        </w:rPr>
-        <w:t xml:space="preserve">views</w:t>
-      </w:r>
-      <w:r>
-        <w:rPr>
-          <w:rtl w:val="0"/>
-        </w:rPr>
-        <w:t xml:space="preserve">, quando aplicável. </w:t>
+        <w:t xml:space="preserve">9. Controle de Acesso e Escopo</w:t>
+      </w:r>
+    </w:p>
+    <w:p>
+      <w:pPr>
+        <w:rPr/>
+      </w:pPr>
+      <w:r>
+        <w:rPr>
+          <w:rtl w:val="0"/>
+        </w:rPr>
+        <w:t xml:space="preserve">O sistema utiliza dois mecanismos complementares:</w:t>
+      </w:r>
+    </w:p>
+    <w:p>
+      <w:pPr>
+        <w:pStyle w:val="Heading3"/>
+        <w:rPr>
+          <w:b w:val="1"/>
+          <w:bCs w:val="1"/>
+          <w:color w:val="000000"/>
+        </w:rPr>
+      </w:pPr>
+      <w:bookmarkStart w:colFirst="0" w:colLast="0" w:name="_h7fyrndijn7p" w:id="17"/>
+      <w:bookmarkEnd w:id="17"/>
+      <w:r>
+        <w:rPr>
+          <w:b w:val="1"/>
+          <w:bCs w:val="1"/>
+          <w:color w:val="000000"/>
+          <w:rtl w:val="0"/>
+        </w:rPr>
+        <w:t xml:space="preserve">9.1 RBAC</w:t>
+      </w:r>
+    </w:p>
+    <w:p>
+      <w:pPr>
+        <w:spacing w:after="240" w:before="240" w:lineRule="auto"/>
+        <w:rPr/>
+      </w:pPr>
+      <w:r>
+        <w:rPr>
+          <w:rtl w:val="0"/>
+        </w:rPr>
+        <w:t xml:space="preserve">O controle de acesso é baseado no modelo RBAC (Role-Based Access Control), com quatro níveis hierárquicos:</w:t>
       </w:r>
     </w:p>
     <w:p>
       <w:pPr>
         <w:numPr>
           <w:ilvl w:val="0"/>
-          <w:numId w:val="12"/>
+          <w:numId w:val="3"/>
         </w:numPr>
         <w:spacing w:after="0" w:afterAutospacing="0" w:before="240" w:lineRule="auto"/>
         <w:ind w:left="720" w:hanging="360"/>
@@ -452,7 +2121,7 @@
         <w:rPr>
           <w:rtl w:val="0"/>
         </w:rPr>
-        <w:t xml:space="preserve">Criação do banco de dados e tabelas</w:t>
+        <w:t xml:space="preserve">Administrador</w:t>
         <w:br w:type="textWrapping"/>
       </w:r>
     </w:p>
@@ -460,7 +2129,7 @@
       <w:pPr>
         <w:numPr>
           <w:ilvl w:val="0"/>
-          <w:numId w:val="12"/>
+          <w:numId w:val="3"/>
         </w:numPr>
         <w:spacing w:after="0" w:afterAutospacing="0" w:before="0" w:beforeAutospacing="0" w:lineRule="auto"/>
         <w:ind w:left="720" w:hanging="360"/>
@@ -469,7 +2138,7 @@
         <w:rPr>
           <w:rtl w:val="0"/>
         </w:rPr>
-        <w:t xml:space="preserve">Inserção de dados iniciais</w:t>
+        <w:t xml:space="preserve">Secretaria</w:t>
         <w:br w:type="textWrapping"/>
       </w:r>
     </w:p>
@@ -477,7 +2146,24 @@
       <w:pPr>
         <w:numPr>
           <w:ilvl w:val="0"/>
-          <w:numId w:val="12"/>
+          <w:numId w:val="3"/>
+        </w:numPr>
+        <w:spacing w:after="0" w:afterAutospacing="0" w:before="0" w:beforeAutospacing="0" w:lineRule="auto"/>
+        <w:ind w:left="720" w:hanging="360"/>
+      </w:pPr>
+      <w:r>
+        <w:rPr>
+          <w:rtl w:val="0"/>
+        </w:rPr>
+        <w:t xml:space="preserve">Associação</w:t>
+        <w:br w:type="textWrapping"/>
+      </w:r>
+    </w:p>
+    <w:p>
+      <w:pPr>
+        <w:numPr>
+          <w:ilvl w:val="0"/>
+          <w:numId w:val="3"/>
         </w:numPr>
         <w:spacing w:after="240" w:before="0" w:beforeAutospacing="0" w:lineRule="auto"/>
         <w:ind w:left="720" w:hanging="360"/>
@@ -486,20 +2172,54 @@
         <w:rPr>
           <w:rtl w:val="0"/>
         </w:rPr>
-        <w:t xml:space="preserve">Criação de views utilizadas pela aplicação</w:t>
-        <w:br w:type="textWrapping"/>
-      </w:r>
-    </w:p>
-    <w:p>
-      <w:pPr>
-        <w:spacing w:after="240" w:before="240" w:lineRule="auto"/>
-        <w:rPr/>
-      </w:pPr>
-      <w:r>
-        <w:rPr>
-          <w:rtl w:val="0"/>
-        </w:rPr>
-        <w:t xml:space="preserve">Essa abordagem simplifica a implantação do sistema, reduz a necessidade de configurações manuais e garante que a estrutura do banco de dados permaneça consistente com os requisitos da aplicação e com o controle de escopo implementado. </w:t>
+        <w:t xml:space="preserve">Usuário</w:t>
+      </w:r>
+    </w:p>
+    <w:p>
+      <w:pPr>
+        <w:spacing w:after="240" w:before="240" w:lineRule="auto"/>
+        <w:ind w:left="0" w:firstLine="0"/>
+        <w:rPr/>
+      </w:pPr>
+      <w:r>
+        <w:rPr>
+          <w:rtl w:val="0"/>
+        </w:rPr>
+        <w:t xml:space="preserve">O nível define quais operações podem ser executadas pelo usuário.</w:t>
+      </w:r>
+    </w:p>
+    <w:p>
+      <w:pPr>
+        <w:pStyle w:val="Heading3"/>
+        <w:spacing w:after="240" w:before="240" w:lineRule="auto"/>
+        <w:rPr>
+          <w:b w:val="1"/>
+          <w:bCs w:val="1"/>
+          <w:color w:val="000000"/>
+        </w:rPr>
+      </w:pPr>
+      <w:bookmarkStart w:colFirst="0" w:colLast="0" w:name="_vkgg27j3f3ew" w:id="18"/>
+      <w:bookmarkEnd w:id="18"/>
+      <w:r>
+        <w:rPr>
+          <w:b w:val="1"/>
+          <w:bCs w:val="1"/>
+          <w:color w:val="000000"/>
+          <w:rtl w:val="0"/>
+        </w:rPr>
+        <w:t xml:space="preserve">9.2 Data Scoping</w:t>
+      </w:r>
+    </w:p>
+    <w:p>
+      <w:pPr>
+        <w:spacing w:after="240" w:before="240" w:lineRule="auto"/>
+        <w:rPr/>
+      </w:pPr>
+      <w:r>
+        <w:rPr>
+          <w:rtl w:val="0"/>
+        </w:rPr>
+        <w:t xml:space="preserve">Além do nível, o sistema aplica escopo de dados, garantindo que cada usuário visualize apenas informações compatíveis com sua Secretaria ou Associação. Esse controle é implementado na camada de serviço por meio de um mecanismo de escopo centralizado.</w:t>
       </w:r>
     </w:p>
     <w:p>
@@ -515,8 +2235,8 @@
           <w:szCs w:val="34"/>
         </w:rPr>
       </w:pPr>
-      <w:bookmarkStart w:colFirst="0" w:colLast="0" w:name="_38gif0ka0ier" w:id="8"/>
-      <w:bookmarkEnd w:id="8"/>
+      <w:bookmarkStart w:colFirst="0" w:colLast="0" w:name="_tureg09jpdto" w:id="19"/>
+      <w:bookmarkEnd w:id="19"/>
       <w:r>
         <w:rPr>
           <w:b w:val="1"/>
@@ -525,243 +2245,112 @@
           <w:szCs w:val="34"/>
           <w:rtl w:val="0"/>
         </w:rPr>
-        <w:t xml:space="preserve">5. Execução da Aplicação</w:t>
-      </w:r>
-    </w:p>
-    <w:p>
-      <w:pPr>
-        <w:spacing w:after="240" w:before="240" w:lineRule="auto"/>
-        <w:rPr/>
-      </w:pPr>
-      <w:r>
-        <w:rPr>
-          <w:rtl w:val="0"/>
-        </w:rPr>
-        <w:t xml:space="preserve">Após a configuração do ambiente e do banco de dados, o servidor pode ser iniciado em modo de produção ou desenvolvimento. O sistema suporta execução com Node.js padrão ou com nodemon para recarregamento automático durante o desenvolvimento.</w:t>
-      </w:r>
-    </w:p>
-    <w:p>
-      <w:pPr>
-        <w:spacing w:after="240" w:before="240" w:lineRule="auto"/>
-        <w:rPr/>
-      </w:pPr>
-      <w:r>
-        <w:rPr>
-          <w:rtl w:val="0"/>
-        </w:rPr>
-        <w:t xml:space="preserve">Ao iniciar, a API ficará disponível para consumo via HTTP, respeitando as rotas e regras de segurança configuradas.</w:t>
-      </w:r>
-    </w:p>
-    <w:p>
-      <w:pPr>
-        <w:pStyle w:val="Heading2"/>
-        <w:keepNext w:val="0"/>
-        <w:keepLines w:val="0"/>
-        <w:spacing w:after="80" w:lineRule="auto"/>
-        <w:rPr>
-          <w:b w:val="1"/>
-          <w:bCs w:val="1"/>
-          <w:sz w:val="34"/>
-          <w:szCs w:val="34"/>
-        </w:rPr>
-      </w:pPr>
-      <w:bookmarkStart w:colFirst="0" w:colLast="0" w:name="_bk1l7ps90h2g" w:id="9"/>
-      <w:bookmarkEnd w:id="9"/>
-      <w:r>
-        <w:rPr>
-          <w:b w:val="1"/>
-          <w:bCs w:val="1"/>
-          <w:sz w:val="34"/>
-          <w:szCs w:val="34"/>
-          <w:rtl w:val="0"/>
-        </w:rPr>
-        <w:t xml:space="preserve">6. Estrutura de Pastas</w:t>
-      </w:r>
-    </w:p>
-    <w:p>
-      <w:pPr>
-        <w:spacing w:after="240" w:before="240" w:lineRule="auto"/>
-        <w:rPr/>
-      </w:pPr>
-      <w:r>
-        <w:rPr>
-          <w:rtl w:val="0"/>
-        </w:rPr>
-        <w:t xml:space="preserve">A API principal segue uma estrutura modular organizada da seguinte forma:</w:t>
-      </w:r>
-    </w:p>
-    <w:p>
-      <w:pPr>
-        <w:numPr>
-          <w:ilvl w:val="0"/>
-          <w:numId w:val="9"/>
-        </w:numPr>
-        <w:spacing w:after="0" w:afterAutospacing="0" w:before="240" w:lineRule="auto"/>
-        <w:ind w:left="720" w:hanging="360"/>
-      </w:pPr>
-      <w:r>
-        <w:rPr>
-          <w:rtl w:val="0"/>
-        </w:rPr>
-        <w:t xml:space="preserve">A pasta </w:t>
-      </w:r>
-      <w:r>
-        <w:rPr>
-          <w:rFonts w:ascii="Roboto Mono" w:cs="Roboto Mono" w:eastAsia="Roboto Mono" w:hAnsi="Roboto Mono"/>
-          <w:color w:val="188038"/>
-          <w:rtl w:val="0"/>
-        </w:rPr>
-        <w:t xml:space="preserve">modules</w:t>
-      </w:r>
-      <w:r>
-        <w:rPr>
-          <w:rtl w:val="0"/>
-        </w:rPr>
-        <w:t xml:space="preserve"> contém os módulos de domínio do sistema, como usuários, secretarias, associações, produtos e movimentações.</w:t>
-        <w:br w:type="textWrapping"/>
-      </w:r>
-    </w:p>
-    <w:p>
-      <w:pPr>
-        <w:numPr>
-          <w:ilvl w:val="0"/>
-          <w:numId w:val="9"/>
-        </w:numPr>
-        <w:spacing w:after="0" w:afterAutospacing="0" w:before="0" w:beforeAutospacing="0" w:lineRule="auto"/>
-        <w:ind w:left="720" w:hanging="360"/>
-      </w:pPr>
-      <w:r>
-        <w:rPr>
-          <w:rtl w:val="0"/>
-        </w:rPr>
-        <w:t xml:space="preserve">A pasta </w:t>
-      </w:r>
-      <w:r>
-        <w:rPr>
-          <w:rFonts w:ascii="Roboto Mono" w:cs="Roboto Mono" w:eastAsia="Roboto Mono" w:hAnsi="Roboto Mono"/>
-          <w:color w:val="188038"/>
-          <w:rtl w:val="0"/>
-        </w:rPr>
-        <w:t xml:space="preserve">shared</w:t>
-      </w:r>
-      <w:r>
-        <w:rPr>
-          <w:rtl w:val="0"/>
-        </w:rPr>
-        <w:t xml:space="preserve"> concentra recursos reutilizáveis, como classes base, utilitários, validações e políticas de acesso.</w:t>
-        <w:br w:type="textWrapping"/>
-      </w:r>
-    </w:p>
-    <w:p>
-      <w:pPr>
-        <w:numPr>
-          <w:ilvl w:val="0"/>
-          <w:numId w:val="9"/>
-        </w:numPr>
-        <w:spacing w:after="0" w:afterAutospacing="0" w:before="0" w:beforeAutospacing="0" w:lineRule="auto"/>
-        <w:ind w:left="720" w:hanging="360"/>
-      </w:pPr>
-      <w:r>
-        <w:rPr>
-          <w:rtl w:val="0"/>
-        </w:rPr>
-        <w:t xml:space="preserve">A pasta </w:t>
-      </w:r>
-      <w:r>
-        <w:rPr>
-          <w:rFonts w:ascii="Roboto Mono" w:cs="Roboto Mono" w:eastAsia="Roboto Mono" w:hAnsi="Roboto Mono"/>
-          <w:color w:val="188038"/>
-          <w:rtl w:val="0"/>
-        </w:rPr>
-        <w:t xml:space="preserve">database</w:t>
-      </w:r>
-      <w:r>
-        <w:rPr>
-          <w:rtl w:val="0"/>
-        </w:rPr>
-        <w:t xml:space="preserve"> contém arquivos relacionados à conexão com o banco de dados.</w:t>
-        <w:br w:type="textWrapping"/>
-      </w:r>
-    </w:p>
-    <w:p>
-      <w:pPr>
-        <w:numPr>
-          <w:ilvl w:val="0"/>
-          <w:numId w:val="9"/>
-        </w:numPr>
-        <w:spacing w:after="240" w:before="0" w:beforeAutospacing="0" w:lineRule="auto"/>
-        <w:ind w:left="720" w:hanging="360"/>
-      </w:pPr>
-      <w:r>
-        <w:rPr>
-          <w:rtl w:val="0"/>
-        </w:rPr>
-        <w:t xml:space="preserve">A pasta </w:t>
-      </w:r>
-      <w:r>
-        <w:rPr>
-          <w:rFonts w:ascii="Roboto Mono" w:cs="Roboto Mono" w:eastAsia="Roboto Mono" w:hAnsi="Roboto Mono"/>
-          <w:color w:val="188038"/>
-          <w:rtl w:val="0"/>
-        </w:rPr>
-        <w:t xml:space="preserve">config</w:t>
-      </w:r>
-      <w:r>
-        <w:rPr>
-          <w:rtl w:val="0"/>
-        </w:rPr>
-        <w:t xml:space="preserve"> armazena configurações globais da aplicação.</w:t>
-        <w:br w:type="textWrapping"/>
-      </w:r>
-    </w:p>
-    <w:p>
-      <w:pPr>
-        <w:spacing w:after="240" w:before="240" w:lineRule="auto"/>
-        <w:rPr/>
-      </w:pPr>
-      <w:r>
-        <w:rPr>
-          <w:rtl w:val="0"/>
-        </w:rPr>
-        <w:t xml:space="preserve">Essa organização promove alta coesão e baixo acoplamento entre os componentes.</w:t>
-      </w:r>
-    </w:p>
-    <w:p>
-      <w:pPr>
-        <w:pStyle w:val="Heading2"/>
-        <w:keepNext w:val="0"/>
-        <w:keepLines w:val="0"/>
-        <w:spacing w:after="80" w:lineRule="auto"/>
-        <w:rPr>
-          <w:b w:val="1"/>
-          <w:bCs w:val="1"/>
-          <w:sz w:val="34"/>
-          <w:szCs w:val="34"/>
-        </w:rPr>
-      </w:pPr>
-      <w:bookmarkStart w:colFirst="0" w:colLast="0" w:name="_l300ylsj9149" w:id="10"/>
-      <w:bookmarkEnd w:id="10"/>
-      <w:r>
-        <w:rPr>
-          <w:b w:val="1"/>
-          <w:bCs w:val="1"/>
-          <w:sz w:val="34"/>
-          <w:szCs w:val="34"/>
-          <w:rtl w:val="0"/>
-        </w:rPr>
-        <w:t xml:space="preserve">7. Arquitetura e Padrão de Desenvolvimento</w:t>
-      </w:r>
-    </w:p>
-    <w:p>
-      <w:pPr>
-        <w:spacing w:after="240" w:before="240" w:lineRule="auto"/>
-        <w:rPr/>
-      </w:pPr>
-      <w:r>
-        <w:rPr>
-          <w:rtl w:val="0"/>
-        </w:rPr>
-        <w:t xml:space="preserve">O sistema adota uma arquitetura monolítica modular baseada no padrão Layered Architecture. As camadas são bem definidas:</w:t>
+        <w:t xml:space="preserve">10. Padrões e Boas Práticas</w:t>
+      </w:r>
+    </w:p>
+    <w:p>
+      <w:pPr>
+        <w:spacing w:after="240" w:before="240" w:lineRule="auto"/>
+        <w:rPr/>
+      </w:pPr>
+      <w:r>
+        <w:rPr>
+          <w:rtl w:val="0"/>
+        </w:rPr>
+        <w:t xml:space="preserve">Além da autorização, a API aplica restrições sobre os próprios dados que podem ser consultados.</w:t>
+      </w:r>
+    </w:p>
+    <w:p>
+      <w:pPr>
+        <w:spacing w:after="240" w:before="240" w:lineRule="auto"/>
+        <w:rPr/>
+      </w:pPr>
+      <w:r>
+        <w:rPr>
+          <w:rtl w:val="0"/>
+        </w:rPr>
+        <w:t xml:space="preserve">Esse mecanismo é implementado através do </w:t>
+      </w:r>
+      <w:r>
+        <w:rPr>
+          <w:b w:val="1"/>
+          <w:bCs w:val="1"/>
+          <w:rtl w:val="0"/>
+        </w:rPr>
+        <w:t xml:space="preserve">BaseScope</w:t>
+      </w:r>
+      <w:r>
+        <w:rPr>
+          <w:rtl w:val="0"/>
+        </w:rPr>
+        <w:t xml:space="preserve">, que adiciona os filtros de escopo diretamente às consultas realizadas no banco.</w:t>
+      </w:r>
+    </w:p>
+    <w:p>
+      <w:pPr>
+        <w:spacing w:after="240" w:before="240" w:lineRule="auto"/>
+        <w:rPr/>
+      </w:pPr>
+      <w:r>
+        <w:rPr>
+          <w:rtl w:val="0"/>
+        </w:rPr>
+        <w:t xml:space="preserve">Dessa forma, a aplicação não realiza uma consulta ampla para posteriormente filtrar os resultados. O banco já recebe a consulta com as restrições correspondentes ao contexto do usuário.</w:t>
+      </w:r>
+    </w:p>
+    <w:p>
+      <w:pPr>
+        <w:spacing w:after="240" w:before="240" w:lineRule="auto"/>
+        <w:rPr/>
+      </w:pPr>
+      <w:r>
+        <w:rPr>
+          <w:rtl w:val="0"/>
+        </w:rPr>
+        <w:t xml:space="preserve">Os endpoints que realizam consultas utilizam esse mecanismo de forma transversal.</w:t>
+      </w:r>
+    </w:p>
+    <w:p>
+      <w:pPr>
+        <w:spacing w:after="240" w:before="240" w:lineRule="auto"/>
+        <w:rPr/>
+      </w:pPr>
+      <w:r>
+        <w:rPr>
+          <w:rtl w:val="0"/>
+        </w:rPr>
+        <w:t xml:space="preserve">Quando aplicável, o escopo </w:t>
+      </w:r>
+      <w:r>
+        <w:rPr>
+          <w:b w:val="1"/>
+          <w:bCs w:val="1"/>
+          <w:rtl w:val="0"/>
+        </w:rPr>
+        <w:t xml:space="preserve">own</w:t>
+      </w:r>
+      <w:r>
+        <w:rPr>
+          <w:rtl w:val="0"/>
+        </w:rPr>
+        <w:t xml:space="preserve"> limita a consulta aos dados pertencentes ao próprio usuário.</w:t>
+      </w:r>
+    </w:p>
+    <w:p>
+      <w:pPr>
+        <w:spacing w:after="240" w:before="240" w:lineRule="auto"/>
+        <w:rPr/>
+      </w:pPr>
+      <w:r>
+        <w:rPr>
+          <w:rtl w:val="0"/>
+        </w:rPr>
+        <w:t xml:space="preserve">Essa abordagem proporciona:</w:t>
+      </w:r>
+      <w:r>
+        <w:rPr>
+          <w:rtl w:val="0"/>
+        </w:rPr>
       </w:r>
     </w:p>
     <w:p>
@@ -777,7 +2366,7 @@
         <w:rPr>
           <w:rtl w:val="0"/>
         </w:rPr>
-        <w:t xml:space="preserve">Controllers são responsáveis apenas pelo controle de fluxo HTTP e resposta ao cliente.</w:t>
+        <w:t xml:space="preserve">Maior segurança;</w:t>
         <w:br w:type="textWrapping"/>
       </w:r>
     </w:p>
@@ -794,7 +2383,7 @@
         <w:rPr>
           <w:rtl w:val="0"/>
         </w:rPr>
-        <w:t xml:space="preserve">Services concentram toda a lógica de negócio, validações e aplicação de escopo.</w:t>
+        <w:t xml:space="preserve">Menor quantidade de dados retornados;</w:t>
         <w:br w:type="textWrapping"/>
       </w:r>
     </w:p>
@@ -811,7 +2400,24 @@
         <w:rPr>
           <w:rtl w:val="0"/>
         </w:rPr>
-        <w:t xml:space="preserve">Repositories encapsulam o acesso ao banco de dados, isolando a lógica SQL.</w:t>
+        <w:t xml:space="preserve">Menor processamento na aplicação;</w:t>
+        <w:br w:type="textWrapping"/>
+      </w:r>
+    </w:p>
+    <w:p>
+      <w:pPr>
+        <w:numPr>
+          <w:ilvl w:val="0"/>
+          <w:numId w:val="10"/>
+        </w:numPr>
+        <w:spacing w:after="0" w:afterAutospacing="0" w:before="0" w:beforeAutospacing="0" w:lineRule="auto"/>
+        <w:ind w:left="720" w:hanging="360"/>
+      </w:pPr>
+      <w:r>
+        <w:rPr>
+          <w:rtl w:val="0"/>
+        </w:rPr>
+        <w:t xml:space="preserve">Melhor desempenho das consultas;</w:t>
         <w:br w:type="textWrapping"/>
       </w:r>
     </w:p>
@@ -828,20 +2434,8 @@
         <w:rPr>
           <w:rtl w:val="0"/>
         </w:rPr>
-        <w:t xml:space="preserve">Policies implementam as regras de autorização e controle de acesso.</w:t>
+        <w:t xml:space="preserve">Padronização da regra de acesso aos dados.</w:t>
         <w:br w:type="textWrapping"/>
-      </w:r>
-    </w:p>
-    <w:p>
-      <w:pPr>
-        <w:spacing w:after="240" w:before="240" w:lineRule="auto"/>
-        <w:rPr/>
-      </w:pPr>
-      <w:r>
-        <w:rPr>
-          <w:rtl w:val="0"/>
-        </w:rPr>
-        <w:t xml:space="preserve">Esse padrão garante clareza, manutenibilidade e segurança no desenvolvimento.</w:t>
       </w:r>
     </w:p>
     <w:p>
@@ -857,8 +2451,8 @@
           <w:szCs w:val="34"/>
         </w:rPr>
       </w:pPr>
-      <w:bookmarkStart w:colFirst="0" w:colLast="0" w:name="_oson55hdof8t" w:id="11"/>
-      <w:bookmarkEnd w:id="11"/>
+      <w:bookmarkStart w:colFirst="0" w:colLast="0" w:name="_tyzjdex72mpx" w:id="20"/>
+      <w:bookmarkEnd w:id="20"/>
       <w:r>
         <w:rPr>
           <w:b w:val="1"/>
@@ -867,31 +2461,131 @@
           <w:szCs w:val="34"/>
           <w:rtl w:val="0"/>
         </w:rPr>
-        <w:t xml:space="preserve">8. Autenticação e Segurança</w:t>
-      </w:r>
-    </w:p>
-    <w:p>
-      <w:pPr>
-        <w:spacing w:after="240" w:before="240" w:lineRule="auto"/>
-        <w:rPr/>
-      </w:pPr>
-      <w:r>
-        <w:rPr>
-          <w:rtl w:val="0"/>
-        </w:rPr>
-        <w:t xml:space="preserve">O sistema utiliza autenticação baseada em JWT (JSON Web Token), permitindo sessões stateless e seguras. Os tokens possuem validade de sete dias e carregam informações essenciais para autorização, como nível de acesso e vínculo institucional.</w:t>
-      </w:r>
-    </w:p>
-    <w:p>
-      <w:pPr>
-        <w:spacing w:after="240" w:before="240" w:lineRule="auto"/>
-        <w:rPr/>
-      </w:pPr>
-      <w:r>
-        <w:rPr>
-          <w:rtl w:val="0"/>
-        </w:rPr>
-        <w:t xml:space="preserve">As senhas são armazenadas de forma criptografada utilizando bcrypt, com uso de salt para aumentar a segurança.</w:t>
+        <w:t xml:space="preserve">11. Manutenção e Evolução</w:t>
+      </w:r>
+    </w:p>
+    <w:p>
+      <w:pPr>
+        <w:spacing w:after="240" w:before="240" w:lineRule="auto"/>
+        <w:rPr/>
+      </w:pPr>
+      <w:r>
+        <w:rPr>
+          <w:rtl w:val="0"/>
+        </w:rPr>
+        <w:t xml:space="preserve">A arquitetura adotada permite evolução gradual do sistema, possibilitando a adição de novos módulos, integração com sistemas externos, geração de relatórios e dashboards analíticos, sem impacto significativo na base existente.</w:t>
+      </w:r>
+    </w:p>
+    <w:p>
+      <w:pPr>
+        <w:spacing w:after="240" w:before="240" w:lineRule="auto"/>
+        <w:rPr/>
+      </w:pPr>
+      <w:r>
+        <w:rPr>
+          <w:rtl w:val="0"/>
+        </w:rPr>
+        <w:t xml:space="preserve">A separação entre camadas e o uso de abstrações facilitam a manutenção corretiva e evolutiva do projeto.</w:t>
+      </w:r>
+    </w:p>
+    <w:p>
+      <w:pPr>
+        <w:pStyle w:val="Heading2"/>
+        <w:keepNext w:val="0"/>
+        <w:keepLines w:val="0"/>
+        <w:spacing w:after="80" w:lineRule="auto"/>
+        <w:rPr>
+          <w:b w:val="1"/>
+          <w:bCs w:val="1"/>
+          <w:sz w:val="34"/>
+          <w:szCs w:val="34"/>
+        </w:rPr>
+      </w:pPr>
+      <w:bookmarkStart w:colFirst="0" w:colLast="0" w:name="_dkn2xmaet836" w:id="21"/>
+      <w:bookmarkEnd w:id="21"/>
+      <w:r>
+        <w:rPr>
+          <w:b w:val="1"/>
+          <w:bCs w:val="1"/>
+          <w:sz w:val="34"/>
+          <w:szCs w:val="34"/>
+          <w:rtl w:val="0"/>
+        </w:rPr>
+        <w:t xml:space="preserve">12. Rotas da API e Payloads</w:t>
+      </w:r>
+    </w:p>
+    <w:p>
+      <w:pPr>
+        <w:spacing w:after="240" w:before="240" w:lineRule="auto"/>
+        <w:rPr/>
+      </w:pPr>
+      <w:r>
+        <w:rPr>
+          <w:rtl w:val="0"/>
+        </w:rPr>
+        <w:t xml:space="preserve">Esta seção descreve as principais rotas expostas pela API Agro Família Pesca, bem como os formatos de payload utilizados nas requisições e respostas. Todas as rotas seguem os princípios REST e utilizam JSON como formato de comunicação.</w:t>
+      </w:r>
+    </w:p>
+    <w:p>
+      <w:pPr>
+        <w:pStyle w:val="Heading3"/>
+        <w:keepNext w:val="0"/>
+        <w:keepLines w:val="0"/>
+        <w:spacing w:after="80" w:lineRule="auto"/>
+        <w:rPr>
+          <w:b w:val="1"/>
+          <w:bCs w:val="1"/>
+        </w:rPr>
+      </w:pPr>
+      <w:bookmarkStart w:colFirst="0" w:colLast="0" w:name="_6alvytlyz72m" w:id="22"/>
+      <w:bookmarkEnd w:id="22"/>
+      <w:r>
+        <w:rPr>
+          <w:b w:val="1"/>
+          <w:bCs w:val="1"/>
+          <w:rtl w:val="0"/>
+        </w:rPr>
+        <w:t xml:space="preserve">12.1 Autenticação</w:t>
+      </w:r>
+    </w:p>
+    <w:p>
+      <w:pPr>
+        <w:spacing w:after="240" w:before="240" w:lineRule="auto"/>
+        <w:rPr/>
+      </w:pPr>
+      <w:r>
+        <w:rPr>
+          <w:rtl w:val="0"/>
+        </w:rPr>
+        <w:t xml:space="preserve">A autenticação do sistema Agro Família Pesca é realizada exclusivamente por meio de </w:t>
+      </w:r>
+      <w:r>
+        <w:rPr>
+          <w:b w:val="1"/>
+          <w:bCs w:val="1"/>
+          <w:rtl w:val="0"/>
+        </w:rPr>
+        <w:t xml:space="preserve">login com credenciais</w:t>
+      </w:r>
+      <w:r>
+        <w:rPr>
+          <w:rtl w:val="0"/>
+        </w:rPr>
+        <w:t xml:space="preserve">, retornando um </w:t>
+      </w:r>
+      <w:r>
+        <w:rPr>
+          <w:b w:val="1"/>
+          <w:bCs w:val="1"/>
+          <w:rtl w:val="0"/>
+        </w:rPr>
+        <w:t xml:space="preserve">JWT (JSON Web Token)</w:t>
+      </w:r>
+      <w:r>
+        <w:rPr>
+          <w:rtl w:val="0"/>
+        </w:rPr>
+        <w:t xml:space="preserve"> válido.</w:t>
       </w:r>
     </w:p>
     <w:p>
@@ -906,668 +2600,8 @@
           <w:color w:val="000000"/>
         </w:rPr>
       </w:pPr>
-      <w:bookmarkStart w:colFirst="0" w:colLast="0" w:name="_o5lseg5tbh4o" w:id="12"/>
-      <w:bookmarkEnd w:id="12"/>
-      <w:r>
-        <w:rPr>
-          <w:b w:val="1"/>
-          <w:bCs w:val="1"/>
-          <w:color w:val="000000"/>
-          <w:rtl w:val="0"/>
-        </w:rPr>
-        <w:t xml:space="preserve">8.1 Tratamento de Senhas em Texto (Legacy Passwords)</w:t>
-      </w:r>
-    </w:p>
-    <w:p>
-      <w:pPr>
-        <w:spacing w:after="240" w:before="240" w:lineRule="auto"/>
-        <w:rPr>
-          <w:b w:val="1"/>
-          <w:bCs w:val="1"/>
-        </w:rPr>
-      </w:pPr>
-      <w:r>
-        <w:rPr>
-          <w:rtl w:val="0"/>
-        </w:rPr>
-        <w:t xml:space="preserve">O sistema </w:t>
-      </w:r>
-      <w:r>
-        <w:rPr>
-          <w:b w:val="1"/>
-          <w:bCs w:val="1"/>
-          <w:rtl w:val="0"/>
-        </w:rPr>
-        <w:t xml:space="preserve">Agro Família Pesca</w:t>
-      </w:r>
-      <w:r>
-        <w:rPr>
-          <w:rtl w:val="0"/>
-        </w:rPr>
-        <w:t xml:space="preserve"> oferece suporte à autenticação de usuários cujas senhas foram armazenadas em texto simples, garantindo compatibilidade com registros antigos </w:t>
-      </w:r>
-      <w:r>
-        <w:rPr>
-          <w:b w:val="1"/>
-          <w:bCs w:val="1"/>
-          <w:rtl w:val="0"/>
-        </w:rPr>
-        <w:t xml:space="preserve">sem comprometer a segurança.</w:t>
-      </w:r>
-    </w:p>
-    <w:p>
-      <w:pPr>
-        <w:spacing w:after="240" w:before="240" w:lineRule="auto"/>
-        <w:rPr/>
-      </w:pPr>
-      <w:r>
-        <w:rPr>
-          <w:rtl w:val="0"/>
-        </w:rPr>
-        <w:t xml:space="preserve">No processo de login, o sistema recupera as credenciais do usuário e verifica se o valor armazenado no campo de senha está no formato de hash bcrypt. Essa verificação é feita dinamicamente durante a autenticação.</w:t>
-      </w:r>
-    </w:p>
-    <w:p>
-      <w:pPr>
-        <w:spacing w:after="240" w:before="240" w:lineRule="auto"/>
-        <w:rPr/>
-      </w:pPr>
-      <w:r>
-        <w:rPr>
-          <w:rtl w:val="0"/>
-        </w:rPr>
-        <w:t xml:space="preserve">Caso a senha </w:t>
-      </w:r>
-      <w:r>
-        <w:rPr>
-          <w:b w:val="1"/>
-          <w:bCs w:val="1"/>
-          <w:rtl w:val="0"/>
-        </w:rPr>
-        <w:t xml:space="preserve">não esteja criptografada</w:t>
-      </w:r>
-      <w:r>
-        <w:rPr>
-          <w:rtl w:val="0"/>
-        </w:rPr>
-        <w:t xml:space="preserve">, o sistema valida o acesso por comparação direta entre a senha informada e o valor armazenado. Após a validação bem-sucedida, </w:t>
-      </w:r>
-      <w:r>
-        <w:rPr>
-          <w:b w:val="1"/>
-          <w:bCs w:val="1"/>
-          <w:rtl w:val="0"/>
-        </w:rPr>
-        <w:t xml:space="preserve">a senha é automaticamente convertida</w:t>
-      </w:r>
-      <w:r>
-        <w:rPr>
-          <w:rtl w:val="0"/>
-        </w:rPr>
-        <w:t xml:space="preserve"> para o formato bcrypt e atualizada no banco de dados, eliminando a necessidade de intervenção manual.</w:t>
-      </w:r>
-    </w:p>
-    <w:p>
-      <w:pPr>
-        <w:spacing w:after="240" w:before="240" w:lineRule="auto"/>
-        <w:rPr/>
-      </w:pPr>
-      <w:r>
-        <w:rPr>
-          <w:rtl w:val="0"/>
-        </w:rPr>
-        <w:t xml:space="preserve">Se a senha já estiver criptografada, a autenticação é realizada normalmente utilizando o mecanismo de comparação segura do bcrypt. Em ambos os cenários, o sistema mantém o mesmo fluxo de geração de token JWT e controle de acesso por nível e escopo.</w:t>
-      </w:r>
-    </w:p>
-    <w:p>
-      <w:pPr>
-        <w:spacing w:after="240" w:before="240" w:lineRule="auto"/>
-        <w:rPr>
-          <w:b w:val="1"/>
-          <w:bCs w:val="1"/>
-        </w:rPr>
-      </w:pPr>
-      <w:r>
-        <w:rPr>
-          <w:b w:val="1"/>
-          <w:bCs w:val="1"/>
-          <w:rtl w:val="0"/>
-        </w:rPr>
-        <w:t xml:space="preserve">Essa abordagem garante:</w:t>
-      </w:r>
-    </w:p>
-    <w:p>
-      <w:pPr>
-        <w:numPr>
-          <w:ilvl w:val="0"/>
-          <w:numId w:val="7"/>
-        </w:numPr>
-        <w:spacing w:after="0" w:afterAutospacing="0" w:before="240" w:lineRule="auto"/>
-        <w:ind w:left="720" w:hanging="360"/>
-        <w:rPr>
-          <w:u w:val="none"/>
-        </w:rPr>
-      </w:pPr>
-      <w:r>
-        <w:rPr>
-          <w:b w:val="1"/>
-          <w:bCs w:val="1"/>
-          <w:rtl w:val="0"/>
-        </w:rPr>
-        <w:t xml:space="preserve">Continuidade</w:t>
-      </w:r>
-      <w:r>
-        <w:rPr>
-          <w:rtl w:val="0"/>
-        </w:rPr>
-        <w:t xml:space="preserve"> do funcionamento do sistema;</w:t>
-      </w:r>
-    </w:p>
-    <w:p>
-      <w:pPr>
-        <w:numPr>
-          <w:ilvl w:val="0"/>
-          <w:numId w:val="7"/>
-        </w:numPr>
-        <w:spacing w:after="0" w:afterAutospacing="0" w:before="0" w:beforeAutospacing="0" w:lineRule="auto"/>
-        <w:ind w:left="720" w:hanging="360"/>
-        <w:rPr>
-          <w:u w:val="none"/>
-        </w:rPr>
-      </w:pPr>
-      <w:r>
-        <w:rPr>
-          <w:b w:val="1"/>
-          <w:bCs w:val="1"/>
-          <w:rtl w:val="0"/>
-        </w:rPr>
-        <w:t xml:space="preserve">Migração automática</w:t>
-      </w:r>
-      <w:r>
-        <w:rPr>
-          <w:rtl w:val="0"/>
-        </w:rPr>
-        <w:t xml:space="preserve"> para padrões modernos de segurança;</w:t>
-      </w:r>
-    </w:p>
-    <w:p>
-      <w:pPr>
-        <w:numPr>
-          <w:ilvl w:val="0"/>
-          <w:numId w:val="7"/>
-        </w:numPr>
-        <w:spacing w:after="0" w:afterAutospacing="0" w:before="0" w:beforeAutospacing="0" w:lineRule="auto"/>
-        <w:ind w:left="720" w:hanging="360"/>
-        <w:rPr>
-          <w:u w:val="none"/>
-        </w:rPr>
-      </w:pPr>
-      <w:r>
-        <w:rPr>
-          <w:b w:val="1"/>
-          <w:bCs w:val="1"/>
-          <w:rtl w:val="0"/>
-        </w:rPr>
-        <w:t xml:space="preserve">Redução de riscos</w:t>
-      </w:r>
-      <w:r>
-        <w:rPr>
-          <w:rtl w:val="0"/>
-        </w:rPr>
-        <w:t xml:space="preserve"> associados ao armazenamento de senhas em texto simples;</w:t>
-      </w:r>
-    </w:p>
-    <w:p>
-      <w:pPr>
-        <w:numPr>
-          <w:ilvl w:val="0"/>
-          <w:numId w:val="7"/>
-        </w:numPr>
-        <w:spacing w:after="240" w:before="0" w:beforeAutospacing="0" w:lineRule="auto"/>
-        <w:ind w:left="720" w:hanging="360"/>
-        <w:rPr>
-          <w:u w:val="none"/>
-        </w:rPr>
-      </w:pPr>
-      <w:r>
-        <w:rPr>
-          <w:b w:val="1"/>
-          <w:bCs w:val="1"/>
-          <w:rtl w:val="0"/>
-        </w:rPr>
-        <w:t xml:space="preserve">Facilidade de manutenção</w:t>
-      </w:r>
-      <w:r>
-        <w:rPr>
-          <w:rtl w:val="0"/>
-        </w:rPr>
-        <w:t xml:space="preserve"> e evolução do sistema.</w:t>
-        <w:br w:type="textWrapping"/>
-        <w:t xml:space="preserve"> </w:t>
-      </w:r>
-    </w:p>
-    <w:p>
-      <w:pPr>
-        <w:pStyle w:val="Heading2"/>
-        <w:keepNext w:val="0"/>
-        <w:keepLines w:val="0"/>
-        <w:spacing w:after="80" w:lineRule="auto"/>
-        <w:rPr>
-          <w:b w:val="1"/>
-          <w:bCs w:val="1"/>
-          <w:sz w:val="34"/>
-          <w:szCs w:val="34"/>
-        </w:rPr>
-      </w:pPr>
-      <w:bookmarkStart w:colFirst="0" w:colLast="0" w:name="_tuvjccr7pku0" w:id="13"/>
-      <w:bookmarkEnd w:id="13"/>
-      <w:r>
-        <w:rPr>
-          <w:b w:val="1"/>
-          <w:bCs w:val="1"/>
-          <w:sz w:val="34"/>
-          <w:szCs w:val="34"/>
-          <w:rtl w:val="0"/>
-        </w:rPr>
-        <w:t xml:space="preserve">9. Controle de Acesso e Escopo</w:t>
-      </w:r>
-    </w:p>
-    <w:p>
-      <w:pPr>
-        <w:spacing w:after="240" w:before="240" w:lineRule="auto"/>
-        <w:rPr/>
-      </w:pPr>
-      <w:r>
-        <w:rPr>
-          <w:rtl w:val="0"/>
-        </w:rPr>
-        <w:t xml:space="preserve">O controle de acesso é baseado no modelo RBAC (Role-Based Access Control), com quatro níveis hierárquicos:</w:t>
-      </w:r>
-    </w:p>
-    <w:p>
-      <w:pPr>
-        <w:numPr>
-          <w:ilvl w:val="0"/>
-          <w:numId w:val="3"/>
-        </w:numPr>
-        <w:spacing w:after="0" w:afterAutospacing="0" w:before="240" w:lineRule="auto"/>
-        <w:ind w:left="720" w:hanging="360"/>
-      </w:pPr>
-      <w:r>
-        <w:rPr>
-          <w:rtl w:val="0"/>
-        </w:rPr>
-        <w:t xml:space="preserve">Administrador</w:t>
-        <w:br w:type="textWrapping"/>
-      </w:r>
-    </w:p>
-    <w:p>
-      <w:pPr>
-        <w:numPr>
-          <w:ilvl w:val="0"/>
-          <w:numId w:val="3"/>
-        </w:numPr>
-        <w:spacing w:after="0" w:afterAutospacing="0" w:before="0" w:beforeAutospacing="0" w:lineRule="auto"/>
-        <w:ind w:left="720" w:hanging="360"/>
-      </w:pPr>
-      <w:r>
-        <w:rPr>
-          <w:rtl w:val="0"/>
-        </w:rPr>
-        <w:t xml:space="preserve">Secretaria</w:t>
-        <w:br w:type="textWrapping"/>
-      </w:r>
-    </w:p>
-    <w:p>
-      <w:pPr>
-        <w:numPr>
-          <w:ilvl w:val="0"/>
-          <w:numId w:val="3"/>
-        </w:numPr>
-        <w:spacing w:after="0" w:afterAutospacing="0" w:before="0" w:beforeAutospacing="0" w:lineRule="auto"/>
-        <w:ind w:left="720" w:hanging="360"/>
-      </w:pPr>
-      <w:r>
-        <w:rPr>
-          <w:rtl w:val="0"/>
-        </w:rPr>
-        <w:t xml:space="preserve">Associação</w:t>
-        <w:br w:type="textWrapping"/>
-      </w:r>
-    </w:p>
-    <w:p>
-      <w:pPr>
-        <w:numPr>
-          <w:ilvl w:val="0"/>
-          <w:numId w:val="3"/>
-        </w:numPr>
-        <w:spacing w:after="240" w:before="0" w:beforeAutospacing="0" w:lineRule="auto"/>
-        <w:ind w:left="720" w:hanging="360"/>
-      </w:pPr>
-      <w:r>
-        <w:rPr>
-          <w:rtl w:val="0"/>
-        </w:rPr>
-        <w:t xml:space="preserve">Usuário</w:t>
-        <w:br w:type="textWrapping"/>
-      </w:r>
-    </w:p>
-    <w:p>
-      <w:pPr>
-        <w:spacing w:after="240" w:before="240" w:lineRule="auto"/>
-        <w:rPr/>
-      </w:pPr>
-      <w:r>
-        <w:rPr>
-          <w:rtl w:val="0"/>
-        </w:rPr>
-        <w:t xml:space="preserve">Além do nível, o sistema aplica escopo de dados, garantindo que cada usuário visualize apenas informações compatíveis com sua Secretaria ou Associação. Esse controle é implementado na camada de serviço por meio de um mecanismo de escopo centralizado.</w:t>
-      </w:r>
-    </w:p>
-    <w:p>
-      <w:pPr>
-        <w:pStyle w:val="Heading2"/>
-        <w:keepNext w:val="0"/>
-        <w:keepLines w:val="0"/>
-        <w:spacing w:after="80" w:lineRule="auto"/>
-        <w:rPr>
-          <w:b w:val="1"/>
-          <w:bCs w:val="1"/>
-          <w:sz w:val="34"/>
-          <w:szCs w:val="34"/>
-        </w:rPr>
-      </w:pPr>
-      <w:bookmarkStart w:colFirst="0" w:colLast="0" w:name="_tureg09jpdto" w:id="14"/>
-      <w:bookmarkEnd w:id="14"/>
-      <w:r>
-        <w:rPr>
-          <w:b w:val="1"/>
-          <w:bCs w:val="1"/>
-          <w:sz w:val="34"/>
-          <w:szCs w:val="34"/>
-          <w:rtl w:val="0"/>
-        </w:rPr>
-        <w:t xml:space="preserve">10. Padrões e Boas Práticas</w:t>
-      </w:r>
-    </w:p>
-    <w:p>
-      <w:pPr>
-        <w:spacing w:after="240" w:before="240" w:lineRule="auto"/>
-        <w:rPr/>
-      </w:pPr>
-      <w:r>
-        <w:rPr>
-          <w:rtl w:val="0"/>
-        </w:rPr>
-        <w:t xml:space="preserve">Durante o desenvolvimento do sistema, foram adotadas as seguintes boas práticas:</w:t>
-      </w:r>
-    </w:p>
-    <w:p>
-      <w:pPr>
-        <w:numPr>
-          <w:ilvl w:val="0"/>
-          <w:numId w:val="8"/>
-        </w:numPr>
-        <w:spacing w:after="0" w:afterAutospacing="0" w:before="240" w:lineRule="auto"/>
-        <w:ind w:left="720" w:hanging="360"/>
-      </w:pPr>
-      <w:r>
-        <w:rPr>
-          <w:rtl w:val="0"/>
-        </w:rPr>
-        <w:t xml:space="preserve">Controllers sem regras de negócio</w:t>
-        <w:br w:type="textWrapping"/>
-      </w:r>
-    </w:p>
-    <w:p>
-      <w:pPr>
-        <w:numPr>
-          <w:ilvl w:val="0"/>
-          <w:numId w:val="8"/>
-        </w:numPr>
-        <w:spacing w:after="0" w:afterAutospacing="0" w:before="0" w:beforeAutospacing="0" w:lineRule="auto"/>
-        <w:ind w:left="720" w:hanging="360"/>
-      </w:pPr>
-      <w:r>
-        <w:rPr>
-          <w:rtl w:val="0"/>
-        </w:rPr>
-        <w:t xml:space="preserve">Validações centralizadas na camada de serviço</w:t>
-        <w:br w:type="textWrapping"/>
-      </w:r>
-    </w:p>
-    <w:p>
-      <w:pPr>
-        <w:numPr>
-          <w:ilvl w:val="0"/>
-          <w:numId w:val="8"/>
-        </w:numPr>
-        <w:spacing w:after="0" w:afterAutospacing="0" w:before="0" w:beforeAutospacing="0" w:lineRule="auto"/>
-        <w:ind w:left="720" w:hanging="360"/>
-      </w:pPr>
-      <w:r>
-        <w:rPr>
-          <w:rtl w:val="0"/>
-        </w:rPr>
-        <w:t xml:space="preserve">Uso de views SQL para operações de leitura</w:t>
-        <w:br w:type="textWrapping"/>
-      </w:r>
-    </w:p>
-    <w:p>
-      <w:pPr>
-        <w:numPr>
-          <w:ilvl w:val="0"/>
-          <w:numId w:val="8"/>
-        </w:numPr>
-        <w:spacing w:after="0" w:afterAutospacing="0" w:before="0" w:beforeAutospacing="0" w:lineRule="auto"/>
-        <w:ind w:left="720" w:hanging="360"/>
-      </w:pPr>
-      <w:r>
-        <w:rPr>
-          <w:rtl w:val="0"/>
-        </w:rPr>
-        <w:t xml:space="preserve">Operações de escrita realizadas apenas em tabelas base</w:t>
-        <w:br w:type="textWrapping"/>
-      </w:r>
-    </w:p>
-    <w:p>
-      <w:pPr>
-        <w:numPr>
-          <w:ilvl w:val="0"/>
-          <w:numId w:val="8"/>
-        </w:numPr>
-        <w:spacing w:after="0" w:afterAutospacing="0" w:before="0" w:beforeAutospacing="0" w:lineRule="auto"/>
-        <w:ind w:left="720" w:hanging="360"/>
-      </w:pPr>
-      <w:r>
-        <w:rPr>
-          <w:rtl w:val="0"/>
-        </w:rPr>
-        <w:t xml:space="preserve">Validação de existência de registros antes de operações destrutivas</w:t>
-        <w:br w:type="textWrapping"/>
-      </w:r>
-    </w:p>
-    <w:p>
-      <w:pPr>
-        <w:numPr>
-          <w:ilvl w:val="0"/>
-          <w:numId w:val="8"/>
-        </w:numPr>
-        <w:spacing w:after="240" w:before="0" w:beforeAutospacing="0" w:lineRule="auto"/>
-        <w:ind w:left="720" w:hanging="360"/>
-      </w:pPr>
-      <w:r>
-        <w:rPr>
-          <w:rtl w:val="0"/>
-        </w:rPr>
-        <w:t xml:space="preserve">Separação clara entre autenticação, autorização e persistência</w:t>
-        <w:br w:type="textWrapping"/>
-      </w:r>
-    </w:p>
-    <w:p>
-      <w:pPr>
-        <w:pStyle w:val="Heading2"/>
-        <w:keepNext w:val="0"/>
-        <w:keepLines w:val="0"/>
-        <w:spacing w:after="80" w:lineRule="auto"/>
-        <w:rPr>
-          <w:b w:val="1"/>
-          <w:bCs w:val="1"/>
-          <w:sz w:val="34"/>
-          <w:szCs w:val="34"/>
-        </w:rPr>
-      </w:pPr>
-      <w:bookmarkStart w:colFirst="0" w:colLast="0" w:name="_tyzjdex72mpx" w:id="15"/>
-      <w:bookmarkEnd w:id="15"/>
-      <w:r>
-        <w:rPr>
-          <w:b w:val="1"/>
-          <w:bCs w:val="1"/>
-          <w:sz w:val="34"/>
-          <w:szCs w:val="34"/>
-          <w:rtl w:val="0"/>
-        </w:rPr>
-        <w:t xml:space="preserve">11. Manutenção e Evolução</w:t>
-      </w:r>
-    </w:p>
-    <w:p>
-      <w:pPr>
-        <w:spacing w:after="240" w:before="240" w:lineRule="auto"/>
-        <w:rPr/>
-      </w:pPr>
-      <w:r>
-        <w:rPr>
-          <w:rtl w:val="0"/>
-        </w:rPr>
-        <w:t xml:space="preserve">A arquitetura adotada permite evolução gradual do sistema, possibilitando a adição de novos módulos, integração com sistemas externos, geração de relatórios e dashboards analíticos, sem impacto significativo na base existente.</w:t>
-      </w:r>
-    </w:p>
-    <w:p>
-      <w:pPr>
-        <w:spacing w:after="240" w:before="240" w:lineRule="auto"/>
-        <w:rPr/>
-      </w:pPr>
-      <w:r>
-        <w:rPr>
-          <w:rtl w:val="0"/>
-        </w:rPr>
-        <w:t xml:space="preserve">A separação entre camadas e o uso de abstrações facilitam a manutenção corretiva e evolutiva do projeto.</w:t>
-      </w:r>
-    </w:p>
-    <w:p>
-      <w:pPr>
-        <w:pStyle w:val="Heading2"/>
-        <w:keepNext w:val="0"/>
-        <w:keepLines w:val="0"/>
-        <w:spacing w:after="80" w:lineRule="auto"/>
-        <w:rPr>
-          <w:b w:val="1"/>
-          <w:bCs w:val="1"/>
-          <w:sz w:val="34"/>
-          <w:szCs w:val="34"/>
-        </w:rPr>
-      </w:pPr>
-      <w:bookmarkStart w:colFirst="0" w:colLast="0" w:name="_dkn2xmaet836" w:id="16"/>
-      <w:bookmarkEnd w:id="16"/>
-      <w:r>
-        <w:rPr>
-          <w:b w:val="1"/>
-          <w:bCs w:val="1"/>
-          <w:sz w:val="34"/>
-          <w:szCs w:val="34"/>
-          <w:rtl w:val="0"/>
-        </w:rPr>
-        <w:t xml:space="preserve">12. Rotas da API e Payloads</w:t>
-      </w:r>
-    </w:p>
-    <w:p>
-      <w:pPr>
-        <w:spacing w:after="240" w:before="240" w:lineRule="auto"/>
-        <w:rPr/>
-      </w:pPr>
-      <w:r>
-        <w:rPr>
-          <w:rtl w:val="0"/>
-        </w:rPr>
-        <w:t xml:space="preserve">Esta seção descreve as principais rotas expostas pela API Agro Família Pesca, bem como os formatos de payload utilizados nas requisições e respostas. Todas as rotas seguem os princípios REST e utilizam JSON como formato de comunicação.</w:t>
-      </w:r>
-    </w:p>
-    <w:p>
-      <w:pPr>
-        <w:pStyle w:val="Heading3"/>
-        <w:keepNext w:val="0"/>
-        <w:keepLines w:val="0"/>
-        <w:spacing w:after="80" w:lineRule="auto"/>
-        <w:rPr>
-          <w:b w:val="1"/>
-          <w:bCs w:val="1"/>
-        </w:rPr>
-      </w:pPr>
-      <w:bookmarkStart w:colFirst="0" w:colLast="0" w:name="_6alvytlyz72m" w:id="17"/>
-      <w:bookmarkEnd w:id="17"/>
-      <w:r>
-        <w:rPr>
-          <w:b w:val="1"/>
-          <w:bCs w:val="1"/>
-          <w:rtl w:val="0"/>
-        </w:rPr>
-        <w:t xml:space="preserve">12.1 Autenticação</w:t>
-      </w:r>
-    </w:p>
-    <w:p>
-      <w:pPr>
-        <w:spacing w:after="240" w:before="240" w:lineRule="auto"/>
-        <w:rPr/>
-      </w:pPr>
-      <w:r>
-        <w:rPr>
-          <w:rtl w:val="0"/>
-        </w:rPr>
-        <w:t xml:space="preserve">A autenticação do sistema Agro Família Pesca é realizada exclusivamente por meio de </w:t>
-      </w:r>
-      <w:r>
-        <w:rPr>
-          <w:b w:val="1"/>
-          <w:bCs w:val="1"/>
-          <w:rtl w:val="0"/>
-        </w:rPr>
-        <w:t xml:space="preserve">login com credenciais</w:t>
-      </w:r>
-      <w:r>
-        <w:rPr>
-          <w:rtl w:val="0"/>
-        </w:rPr>
-        <w:t xml:space="preserve">, retornando um </w:t>
-      </w:r>
-      <w:r>
-        <w:rPr>
-          <w:b w:val="1"/>
-          <w:bCs w:val="1"/>
-          <w:rtl w:val="0"/>
-        </w:rPr>
-        <w:t xml:space="preserve">JWT (JSON Web Token)</w:t>
-      </w:r>
-      <w:r>
-        <w:rPr>
-          <w:rtl w:val="0"/>
-        </w:rPr>
-        <w:t xml:space="preserve"> válido.</w:t>
-      </w:r>
-    </w:p>
-    <w:p>
-      <w:pPr>
-        <w:pStyle w:val="Heading4"/>
-        <w:keepNext w:val="0"/>
-        <w:keepLines w:val="0"/>
-        <w:spacing w:before="280" w:lineRule="auto"/>
-        <w:rPr>
-          <w:b w:val="1"/>
-          <w:bCs w:val="1"/>
-          <w:color w:val="000000"/>
-        </w:rPr>
-      </w:pPr>
-      <w:bookmarkStart w:colFirst="0" w:colLast="0" w:name="_nexcwdvitced" w:id="18"/>
-      <w:bookmarkEnd w:id="18"/>
+      <w:bookmarkStart w:colFirst="0" w:colLast="0" w:name="_nexcwdvitced" w:id="23"/>
+      <w:bookmarkEnd w:id="23"/>
       <w:r>
         <w:rPr>
           <w:b w:val="1"/>
@@ -2117,35 +3151,41 @@
         <w:rPr>
           <w:rtl w:val="0"/>
         </w:rPr>
-        <w:t xml:space="preserve">O controle de acesso é aplicado nas camadas de </w:t>
-      </w:r>
-      <w:r>
-        <w:rPr>
-          <w:b w:val="1"/>
-          <w:bCs w:val="1"/>
-          <w:rtl w:val="0"/>
-        </w:rPr>
-        <w:t xml:space="preserve">Service</w:t>
-      </w:r>
-      <w:r>
-        <w:rPr>
-          <w:rtl w:val="0"/>
-        </w:rPr>
-        <w:t xml:space="preserve"> e </w:t>
-      </w:r>
-      <w:r>
-        <w:rPr>
-          <w:b w:val="1"/>
-          <w:bCs w:val="1"/>
-          <w:rtl w:val="0"/>
-        </w:rPr>
-        <w:t xml:space="preserve">Policy</w:t>
-      </w:r>
-      <w:r>
-        <w:rPr>
-          <w:rtl w:val="0"/>
-        </w:rPr>
-        <w:t xml:space="preserve">, não no Controller.</w:t>
+        <w:t xml:space="preserve">O Controller é responsável pelo fluxo HTTP. A autorização é determinada pelas </w:t>
+      </w:r>
+      <w:r>
+        <w:rPr>
+          <w:b w:val="1"/>
+          <w:bCs w:val="1"/>
+          <w:rtl w:val="0"/>
+        </w:rPr>
+        <w:t xml:space="preserve">Policies</w:t>
+      </w:r>
+      <w:r>
+        <w:rPr>
+          <w:rtl w:val="0"/>
+        </w:rPr>
+        <w:t xml:space="preserve">, enquanto o controle de escopo dos dados é aplicado pelo </w:t>
+      </w:r>
+      <w:r>
+        <w:rPr>
+          <w:b w:val="1"/>
+          <w:bCs w:val="1"/>
+          <w:rtl w:val="0"/>
+        </w:rPr>
+        <w:t xml:space="preserve">BaseScope</w:t>
+      </w:r>
+      <w:r>
+        <w:rPr>
+          <w:rtl w:val="0"/>
+        </w:rPr>
+        <w:t xml:space="preserve"> </w:t>
+      </w:r>
+      <w:r>
+        <w:rPr>
+          <w:rtl w:val="0"/>
+        </w:rPr>
+        <w:t xml:space="preserve">durante a construção das consultas.</w:t>
       </w:r>
     </w:p>
     <w:p>
@@ -2192,8 +3232,8 @@
           <w:szCs w:val="26"/>
         </w:rPr>
       </w:pPr>
-      <w:bookmarkStart w:colFirst="0" w:colLast="0" w:name="_v6loy1oqo229" w:id="19"/>
-      <w:bookmarkEnd w:id="19"/>
+      <w:bookmarkStart w:colFirst="0" w:colLast="0" w:name="_v6loy1oqo229" w:id="24"/>
+      <w:bookmarkEnd w:id="24"/>
       <w:r>
         <w:rPr>
           <w:b w:val="1"/>
@@ -3178,8 +4218,8 @@
           <w:szCs w:val="26"/>
         </w:rPr>
       </w:pPr>
-      <w:bookmarkStart w:colFirst="0" w:colLast="0" w:name="_xn0p9fdspnp" w:id="20"/>
-      <w:bookmarkEnd w:id="20"/>
+      <w:bookmarkStart w:colFirst="0" w:colLast="0" w:name="_xn0p9fdspnp" w:id="25"/>
+      <w:bookmarkEnd w:id="25"/>
       <w:r>
         <w:rPr>
           <w:b w:val="1"/>
@@ -3391,8 +4431,8 @@
           <w:szCs w:val="26"/>
         </w:rPr>
       </w:pPr>
-      <w:bookmarkStart w:colFirst="0" w:colLast="0" w:name="_5eh5tbxujrgd" w:id="21"/>
-      <w:bookmarkEnd w:id="21"/>
+      <w:bookmarkStart w:colFirst="0" w:colLast="0" w:name="_5eh5tbxujrgd" w:id="26"/>
+      <w:bookmarkEnd w:id="26"/>
       <w:r>
         <w:rPr>
           <w:b w:val="1"/>
@@ -3611,8 +4651,8 @@
           <w:szCs w:val="26"/>
         </w:rPr>
       </w:pPr>
-      <w:bookmarkStart w:colFirst="0" w:colLast="0" w:name="_6bp8347b84x" w:id="22"/>
-      <w:bookmarkEnd w:id="22"/>
+      <w:bookmarkStart w:colFirst="0" w:colLast="0" w:name="_6bp8347b84x" w:id="27"/>
+      <w:bookmarkEnd w:id="27"/>
       <w:r>
         <w:rPr>
           <w:b w:val="1"/>
@@ -3825,8 +4865,8 @@
           <w:szCs w:val="26"/>
         </w:rPr>
       </w:pPr>
-      <w:bookmarkStart w:colFirst="0" w:colLast="0" w:name="_3zsg5g1io2xh" w:id="23"/>
-      <w:bookmarkEnd w:id="23"/>
+      <w:bookmarkStart w:colFirst="0" w:colLast="0" w:name="_3zsg5g1io2xh" w:id="28"/>
+      <w:bookmarkEnd w:id="28"/>
       <w:r>
         <w:rPr>
           <w:b w:val="1"/>
@@ -4039,8 +5079,8 @@
           <w:szCs w:val="26"/>
         </w:rPr>
       </w:pPr>
-      <w:bookmarkStart w:colFirst="0" w:colLast="0" w:name="_8sxesprutnaa" w:id="24"/>
-      <w:bookmarkEnd w:id="24"/>
+      <w:bookmarkStart w:colFirst="0" w:colLast="0" w:name="_8sxesprutnaa" w:id="29"/>
+      <w:bookmarkEnd w:id="29"/>
       <w:r>
         <w:rPr>
           <w:b w:val="1"/>
@@ -4316,8 +5356,8 @@
           <w:szCs w:val="26"/>
         </w:rPr>
       </w:pPr>
-      <w:bookmarkStart w:colFirst="0" w:colLast="0" w:name="_kdstf4lxqc0w" w:id="25"/>
-      <w:bookmarkEnd w:id="25"/>
+      <w:bookmarkStart w:colFirst="0" w:colLast="0" w:name="_kdstf4lxqc0w" w:id="30"/>
+      <w:bookmarkEnd w:id="30"/>
       <w:r>
         <w:rPr>
           <w:b w:val="1"/>
@@ -4504,8 +5544,8 @@
           <w:szCs w:val="26"/>
         </w:rPr>
       </w:pPr>
-      <w:bookmarkStart w:colFirst="0" w:colLast="0" w:name="_rj8z9qlgdwf7" w:id="26"/>
-      <w:bookmarkEnd w:id="26"/>
+      <w:bookmarkStart w:colFirst="0" w:colLast="0" w:name="_rj8z9qlgdwf7" w:id="31"/>
+      <w:bookmarkEnd w:id="31"/>
       <w:r>
         <w:rPr>
           <w:b w:val="1"/>
@@ -4762,8 +5802,8 @@
           <w:szCs w:val="34"/>
         </w:rPr>
       </w:pPr>
-      <w:bookmarkStart w:colFirst="0" w:colLast="0" w:name="_udfy13xjswx0" w:id="27"/>
-      <w:bookmarkEnd w:id="27"/>
+      <w:bookmarkStart w:colFirst="0" w:colLast="0" w:name="_udfy13xjswx0" w:id="32"/>
+      <w:bookmarkEnd w:id="32"/>
       <w:r>
         <w:rPr>
           <w:b w:val="1"/>
@@ -4867,8 +5907,8 @@
           <w:szCs w:val="34"/>
         </w:rPr>
       </w:pPr>
-      <w:bookmarkStart w:colFirst="0" w:colLast="0" w:name="_romca7yy4wpy" w:id="28"/>
-      <w:bookmarkEnd w:id="28"/>
+      <w:bookmarkStart w:colFirst="0" w:colLast="0" w:name="_romca7yy4wpy" w:id="33"/>
+      <w:bookmarkEnd w:id="33"/>
       <w:r>
         <w:rPr>
           <w:b w:val="1"/>
@@ -4915,6 +5955,7 @@
       </w:r>
     </w:p>
     <w:sectPr>
+      <w:footerReference r:id="rId6" w:type="default"/>
       <w:pgSz w:h="16834" w:w="11909" w:orient="portrait"/>
       <w:pgMar w:bottom="1440" w:top="1440" w:left="1440" w:right="1440" w:header="720" w:footer="720"/>
       <w:pgNumType w:start="1"/>
@@ -4923,6 +5964,21 @@
 </w:document>
 </file>
 
+<file path=word/footer1.xml><?xml version="1.0" encoding="utf-8"?>
+<w:ftr xmlns:mc="http://schemas.openxmlformats.org/markup-compatibility/2006" xmlns:o="urn:schemas-microsoft-com:office:office" xmlns:r="http://schemas.openxmlformats.org/officeDocument/2006/relationships" xmlns:m="http://schemas.openxmlformats.org/officeDocument/2006/math" xmlns:v="urn:schemas-microsoft-com:vml" xmlns:wp="http://schemas.openxmlformats.org/drawingml/2006/wordprocessingDrawing" xmlns:w10="urn:schemas-microsoft-com:office:word" xmlns:w="http://schemas.openxmlformats.org/wordprocessingml/2006/main" xmlns:wne="http://schemas.microsoft.com/office/word/2006/wordml" xmlns:sl="http://schemas.openxmlformats.org/schemaLibrary/2006/main" xmlns:a="http://schemas.openxmlformats.org/drawingml/2006/main" xmlns:pic="http://schemas.openxmlformats.org/drawingml/2006/picture" xmlns:c="http://schemas.openxmlformats.org/drawingml/2006/chart" xmlns:lc="http://schemas.openxmlformats.org/drawingml/2006/lockedCanvas" xmlns:dgm="http://schemas.openxmlformats.org/drawingml/2006/diagram" xmlns:wps="http://schemas.microsoft.com/office/word/2010/wordprocessingShape" xmlns:wpg="http://schemas.microsoft.com/office/word/2010/wordprocessingGroup" xmlns:w14="http://schemas.microsoft.com/office/word/2010/wordml" xmlns:w15="http://schemas.microsoft.com/office/word/2012/wordml" xmlns:w16="http://schemas.microsoft.com/office/word/2018/wordml" xmlns:w16cex="http://schemas.microsoft.com/office/word/2018/wordml/cex" xmlns:w16cid="http://schemas.microsoft.com/office/word/2016/wordml/cid" xmlns="http://schemas.microsoft.com/office/tasks/2019/documenttasks" xmlns:cr="http://schemas.microsoft.com/office/comments/2020/reactions">
+  <w:p>
+    <w:pPr>
+      <w:rPr/>
+    </w:pPr>
+    <w:r>
+      <w:rPr>
+        <w:rtl w:val="0"/>
+      </w:rPr>
+    </w:r>
+  </w:p>
+</w:ftr>
+</file>
+
 <file path=word/numbering.xml><?xml version="1.0" encoding="utf-8"?>
 <w:numbering xmlns:mc="http://schemas.openxmlformats.org/markup-compatibility/2006" xmlns:o="urn:schemas-microsoft-com:office:office" xmlns:r="http://schemas.openxmlformats.org/officeDocument/2006/relationships" xmlns:m="http://schemas.openxmlformats.org/officeDocument/2006/math" xmlns:v="urn:schemas-microsoft-com:vml" xmlns:wp="http://schemas.openxmlformats.org/drawingml/2006/wordprocessingDrawing" xmlns:w10="urn:schemas-microsoft-com:office:word" xmlns:w="http://schemas.openxmlformats.org/wordprocessingml/2006/main" xmlns:wne="http://schemas.microsoft.com/office/word/2006/wordml" xmlns:sl="http://schemas.openxmlformats.org/schemaLibrary/2006/main" xmlns:a="http://schemas.openxmlformats.org/drawingml/2006/main" xmlns:pic="http://schemas.openxmlformats.org/drawingml/2006/picture" xmlns:c="http://schemas.openxmlformats.org/drawingml/2006/chart" xmlns:lc="http://schemas.openxmlformats.org/drawingml/2006/lockedCanvas" xmlns:dgm="http://schemas.openxmlformats.org/drawingml/2006/diagram" xmlns:wps="http://schemas.microsoft.com/office/word/2010/wordprocessingShape" xmlns:wpg="http://schemas.microsoft.com/office/word/2010/wordprocessingGroup" xmlns:w14="http://schemas.microsoft.com/office/word/2010/wordml" xmlns:w15="http://schemas.microsoft.com/office/word/2012/wordml" xmlns:w16="http://schemas.microsoft.com/office/word/2018/wordml" xmlns:w16cex="http://schemas.microsoft.com/office/word/2018/wordml/cex" xmlns:w16cid="http://schemas.microsoft.com/office/word/2016/wordml/cid" xmlns="http://schemas.microsoft.com/office/tasks/2019/documenttasks" xmlns:cr="http://schemas.microsoft.com/office/comments/2020/reactions">
   <w:abstractNum w:abstractNumId="1">
@@ -6136,6 +7192,116 @@
     </w:lvl>
   </w:abstractNum>
   <w:abstractNum w:abstractNumId="12">
+    <w:lvl w:ilvl="0">
+      <w:start w:val="1"/>
+      <w:numFmt w:val="bullet"/>
+      <w:lvlText w:val="●"/>
+      <w:lvlJc w:val="left"/>
+      <w:pPr>
+        <w:ind w:left="720" w:hanging="360"/>
+      </w:pPr>
+      <w:rPr>
+        <w:u w:val="none"/>
+      </w:rPr>
+    </w:lvl>
+    <w:lvl w:ilvl="1">
+      <w:start w:val="1"/>
+      <w:numFmt w:val="bullet"/>
+      <w:lvlText w:val="○"/>
+      <w:lvlJc w:val="left"/>
+      <w:pPr>
+        <w:ind w:left="1440" w:hanging="360"/>
+      </w:pPr>
+      <w:rPr>
+        <w:u w:val="none"/>
+      </w:rPr>
+    </w:lvl>
+    <w:lvl w:ilvl="2">
+      <w:start w:val="1"/>
+      <w:numFmt w:val="bullet"/>
+      <w:lvlText w:val="■"/>
+      <w:lvlJc w:val="left"/>
+      <w:pPr>
+        <w:ind w:left="2160" w:hanging="360"/>
+      </w:pPr>
+      <w:rPr>
+        <w:u w:val="none"/>
+      </w:rPr>
+    </w:lvl>
+    <w:lvl w:ilvl="3">
+      <w:start w:val="1"/>
+      <w:numFmt w:val="bullet"/>
+      <w:lvlText w:val="●"/>
+      <w:lvlJc w:val="left"/>
+      <w:pPr>
+        <w:ind w:left="2880" w:hanging="360"/>
+      </w:pPr>
+      <w:rPr>
+        <w:u w:val="none"/>
+      </w:rPr>
+    </w:lvl>
+    <w:lvl w:ilvl="4">
+      <w:start w:val="1"/>
+      <w:numFmt w:val="bullet"/>
+      <w:lvlText w:val="○"/>
+      <w:lvlJc w:val="left"/>
+      <w:pPr>
+        <w:ind w:left="3600" w:hanging="360"/>
+      </w:pPr>
+      <w:rPr>
+        <w:u w:val="none"/>
+      </w:rPr>
+    </w:lvl>
+    <w:lvl w:ilvl="5">
+      <w:start w:val="1"/>
+      <w:numFmt w:val="bullet"/>
+      <w:lvlText w:val="■"/>
+      <w:lvlJc w:val="left"/>
+      <w:pPr>
+        <w:ind w:left="4320" w:hanging="360"/>
+      </w:pPr>
+      <w:rPr>
+        <w:u w:val="none"/>
+      </w:rPr>
+    </w:lvl>
+    <w:lvl w:ilvl="6">
+      <w:start w:val="1"/>
+      <w:numFmt w:val="bullet"/>
+      <w:lvlText w:val="●"/>
+      <w:lvlJc w:val="left"/>
+      <w:pPr>
+        <w:ind w:left="5040" w:hanging="360"/>
+      </w:pPr>
+      <w:rPr>
+        <w:u w:val="none"/>
+      </w:rPr>
+    </w:lvl>
+    <w:lvl w:ilvl="7">
+      <w:start w:val="1"/>
+      <w:numFmt w:val="bullet"/>
+      <w:lvlText w:val="○"/>
+      <w:lvlJc w:val="left"/>
+      <w:pPr>
+        <w:ind w:left="5760" w:hanging="360"/>
+      </w:pPr>
+      <w:rPr>
+        <w:u w:val="none"/>
+      </w:rPr>
+    </w:lvl>
+    <w:lvl w:ilvl="8">
+      <w:start w:val="1"/>
+      <w:numFmt w:val="bullet"/>
+      <w:lvlText w:val="■"/>
+      <w:lvlJc w:val="left"/>
+      <w:pPr>
+        <w:ind w:left="6480" w:hanging="360"/>
+      </w:pPr>
+      <w:rPr>
+        <w:u w:val="none"/>
+      </w:rPr>
+    </w:lvl>
+  </w:abstractNum>
+  <w:abstractNum w:abstractNumId="13">
     <w:lvl w:ilvl="0">
       <w:start w:val="1"/>
       <w:numFmt w:val="bullet"/>
@@ -6280,6 +7446,9 @@
   </w:num>
   <w:num w:numId="12">
     <w:abstractNumId w:val="12"/>
+  </w:num>
+  <w:num w:numId="13">
+    <w:abstractNumId w:val="13"/>
   </w:num>
 </w:numbering>
 </file>

</xml_diff>